<commit_message>
docs: devis ramené à 550 000 FCFA HT
Co-Authored-By: Claude Opus 5.5 <noreply@anthropic.com>
Claude-Session: https://claude.ai/code/session_01CG3dz7AHdi9j6oqdbyU82n
</commit_message>
<xml_diff>
--- a/docs/devis/Devis_Plateforme_Engins_Poids_Lourds.docx
+++ b/docs/devis/Devis_Plateforme_Engins_Poids_Lourds.docx
@@ -39,10 +39,10 @@
         <w:rPr>
           <w:b/>
         </w:rPr>
-        <w:t xml:space="preserve">29 325 000 FCFA HT</w:t>
-      </w:r>
-      <w:r>
-        <w:t xml:space="preserve"> (34 603 500 FCFA TTC), pour une livraison complète en </w:t>
+        <w:t xml:space="preserve">550 000 FCFA HT</w:t>
+      </w:r>
+      <w:r>
+        <w:t xml:space="preserve"> (649 000 FCFA TTC), pour une livraison complète en </w:t>
       </w:r>
       <w:r>
         <w:rPr>
@@ -2058,25 +2058,16 @@
     <w:p>
       <w:pPr/>
       <w:r>
-        <w:t xml:space="preserve">Le projet représente </w:t>
+        <w:t xml:space="preserve">Le projet est proposé au </w:t>
       </w:r>
       <w:r>
         <w:rPr>
           <w:b/>
         </w:rPr>
-        <w:t xml:space="preserve">174 jours-homme</w:t>
-      </w:r>
-      <w:r>
-        <w:t xml:space="preserve"> pour </w:t>
-      </w:r>
-      <w:r>
-        <w:rPr>
-          <w:b/>
-        </w:rPr>
-        <w:t xml:space="preserve">29 325 000 FCFA HT</w:t>
-      </w:r>
-      <w:r>
-        <w:t xml:space="preserve"> (≈ 44 706 EUR HT). Le développement (phase 2) pèse 60 % du budget.</w:t>
+        <w:t xml:space="preserve">prix forfaitaire de 550 000 FCFA HT</w:t>
+      </w:r>
+      <w:r>
+        <w:t xml:space="preserve"> (≈ 838 EUR HT), pour un effort estimé à 174 jours-homme. Le développement (phase 2) pèse 60 % du budget.</w:t>
       </w:r>
     </w:p>
     <w:p>
@@ -2084,218 +2075,15 @@
         <w:pStyle w:val="Heading3"/>
       </w:pPr>
       <w:r>
-        <w:t xml:space="preserve">Taux journaliers appliqués (TJM)</w:t>
-      </w:r>
-    </w:p>
-    <w:tbl>
-      <w:tblPr>
-        <w:tblStyle w:val="TableGrid"/>
-        <w:tblW w:w="0" w:type="auto"/>
-        <w:tblLayout w:type="fixed"/>
-        <w:tblLook w:val="04A0" w:firstRow="1" w:lastRow="0" w:firstColumn="0" w:lastColumn="0" w:noHBand="0" w:noVBand="1"/>
-      </w:tblPr>
-      <w:tblGrid>
-        <w:gridCol w:w="4680"/>
-        <w:gridCol w:w="4680"/>
-      </w:tblGrid>
-      <w:tr>
-        <w:trPr>
-          <w:tblHeader/>
-        </w:trPr>
-        <w:tc>
-          <w:tcPr>
-            <w:tcW w:w="4680" w:type="dxa"/>
-            <w:shd w:val="clear" w:color="auto" w:fill="F2F2F2"/>
-          </w:tcPr>
-          <w:p>
-            <w:pPr/>
-            <w:r>
-              <w:t xml:space="preserve">Profil</w:t>
-            </w:r>
-          </w:p>
-        </w:tc>
-        <w:tc>
-          <w:tcPr>
-            <w:tcW w:w="4680" w:type="dxa"/>
-            <w:shd w:val="clear" w:color="auto" w:fill="F2F2F2"/>
-          </w:tcPr>
-          <w:p>
-            <w:pPr/>
-            <w:r>
-              <w:t xml:space="preserve">TJM (FCFA HT)</w:t>
-            </w:r>
-          </w:p>
-        </w:tc>
-      </w:tr>
-      <w:tr>
-        <w:tc>
-          <w:tcPr>
-            <w:tcW w:w="4680" w:type="dxa"/>
-          </w:tcPr>
-          <w:p>
-            <w:pPr/>
-            <w:r>
-              <w:t xml:space="preserve">Chef de projet / Business Analyst</w:t>
-            </w:r>
-          </w:p>
-        </w:tc>
-        <w:tc>
-          <w:tcPr>
-            <w:tcW w:w="4680" w:type="dxa"/>
-          </w:tcPr>
-          <w:p>
-            <w:pPr/>
-            <w:r>
-              <w:t xml:space="preserve">200 000</w:t>
-            </w:r>
-          </w:p>
-        </w:tc>
-      </w:tr>
-      <w:tr>
-        <w:tc>
-          <w:tcPr>
-            <w:tcW w:w="4680" w:type="dxa"/>
-          </w:tcPr>
-          <w:p>
-            <w:pPr/>
-            <w:r>
-              <w:t xml:space="preserve">Développeur backend senior (Laravel, API)</w:t>
-            </w:r>
-          </w:p>
-        </w:tc>
-        <w:tc>
-          <w:tcPr>
-            <w:tcW w:w="4680" w:type="dxa"/>
-          </w:tcPr>
-          <w:p>
-            <w:pPr/>
-            <w:r>
-              <w:t xml:space="preserve">175 000</w:t>
-            </w:r>
-          </w:p>
-        </w:tc>
-      </w:tr>
-      <w:tr>
-        <w:tc>
-          <w:tcPr>
-            <w:tcW w:w="4680" w:type="dxa"/>
-          </w:tcPr>
-          <w:p>
-            <w:pPr/>
-            <w:r>
-              <w:t xml:space="preserve">Développeur mobile Flutter</w:t>
-            </w:r>
-          </w:p>
-        </w:tc>
-        <w:tc>
-          <w:tcPr>
-            <w:tcW w:w="4680" w:type="dxa"/>
-          </w:tcPr>
-          <w:p>
-            <w:pPr/>
-            <w:r>
-              <w:t xml:space="preserve">175 000</w:t>
-            </w:r>
-          </w:p>
-        </w:tc>
-      </w:tr>
-      <w:tr>
-        <w:tc>
-          <w:tcPr>
-            <w:tcW w:w="4680" w:type="dxa"/>
-          </w:tcPr>
-          <w:p>
-            <w:pPr/>
-            <w:r>
-              <w:t xml:space="preserve">Ingénieur DevOps</w:t>
-            </w:r>
-          </w:p>
-        </w:tc>
-        <w:tc>
-          <w:tcPr>
-            <w:tcW w:w="4680" w:type="dxa"/>
-          </w:tcPr>
-          <w:p>
-            <w:pPr/>
-            <w:r>
-              <w:t xml:space="preserve">175 000</w:t>
-            </w:r>
-          </w:p>
-        </w:tc>
-      </w:tr>
-      <w:tr>
-        <w:tc>
-          <w:tcPr>
-            <w:tcW w:w="4680" w:type="dxa"/>
-          </w:tcPr>
-          <w:p>
-            <w:pPr/>
-            <w:r>
-              <w:t xml:space="preserve">Développeur frontend web</w:t>
-            </w:r>
-          </w:p>
-        </w:tc>
-        <w:tc>
-          <w:tcPr>
-            <w:tcW w:w="4680" w:type="dxa"/>
-          </w:tcPr>
-          <w:p>
-            <w:pPr/>
-            <w:r>
-              <w:t xml:space="preserve">150 000</w:t>
-            </w:r>
-          </w:p>
-        </w:tc>
-      </w:tr>
-      <w:tr>
-        <w:tc>
-          <w:tcPr>
-            <w:tcW w:w="4680" w:type="dxa"/>
-          </w:tcPr>
-          <w:p>
-            <w:pPr/>
-            <w:r>
-              <w:t xml:space="preserve">Designer UI/UX</w:t>
-            </w:r>
-          </w:p>
-        </w:tc>
-        <w:tc>
-          <w:tcPr>
-            <w:tcW w:w="4680" w:type="dxa"/>
-          </w:tcPr>
-          <w:p>
-            <w:pPr/>
-            <w:r>
-              <w:t xml:space="preserve">150 000</w:t>
-            </w:r>
-          </w:p>
-        </w:tc>
-      </w:tr>
-      <w:tr>
-        <w:tc>
-          <w:tcPr>
-            <w:tcW w:w="4680" w:type="dxa"/>
-          </w:tcPr>
-          <w:p>
-            <w:pPr/>
-            <w:r>
-              <w:t xml:space="preserve">Testeur QA</w:t>
-            </w:r>
-          </w:p>
-        </w:tc>
-        <w:tc>
-          <w:tcPr>
-            <w:tcW w:w="4680" w:type="dxa"/>
-          </w:tcPr>
-          <w:p>
-            <w:pPr/>
-            <w:r>
-              <w:t xml:space="preserve">120 000</w:t>
-            </w:r>
-          </w:p>
-        </w:tc>
-      </w:tr>
-    </w:tbl>
+        <w:t xml:space="preserve">Base de tarification</w:t>
+      </w:r>
+    </w:p>
+    <w:p>
+      <w:pPr/>
+      <w:r>
+        <w:t xml:space="preserve">Le prix est forfaitaire et ferme : les jours-homme indiquent l'effort estimé par tâche, les montants la répartition du forfait global. Aucun dépassement ne sera facturé à périmètre constant.</w:t>
+      </w:r>
+    </w:p>
     <w:p>
       <w:pPr>
         <w:pStyle w:val="Heading3"/>
@@ -2444,7 +2232,7 @@
               <w:rPr>
                 <w:b/>
               </w:rPr>
-              <w:t xml:space="preserve">4 100 000</w:t>
+              <w:t xml:space="preserve">76 500</w:t>
             </w:r>
           </w:p>
         </w:tc>
@@ -2501,7 +2289,7 @@
           <w:p>
             <w:pPr/>
             <w:r>
-              <w:t xml:space="preserve">1 600 000</w:t>
+              <w:t xml:space="preserve">30 000</w:t>
             </w:r>
           </w:p>
         </w:tc>
@@ -2558,7 +2346,7 @@
           <w:p>
             <w:pPr/>
             <w:r>
-              <w:t xml:space="preserve">700 000</w:t>
+              <w:t xml:space="preserve">13 000</w:t>
             </w:r>
           </w:p>
         </w:tc>
@@ -2615,7 +2403,7 @@
           <w:p>
             <w:pPr/>
             <w:r>
-              <w:t xml:space="preserve">1 800 000</w:t>
+              <w:t xml:space="preserve">33 500</w:t>
             </w:r>
           </w:p>
         </w:tc>
@@ -2681,7 +2469,7 @@
               <w:rPr>
                 <w:b/>
               </w:rPr>
-              <w:t xml:space="preserve">17 575 000</w:t>
+              <w:t xml:space="preserve">329 500</w:t>
             </w:r>
           </w:p>
         </w:tc>
@@ -2738,7 +2526,7 @@
           <w:p>
             <w:pPr/>
             <w:r>
-              <w:t xml:space="preserve">1 050 000</w:t>
+              <w:t xml:space="preserve">19 500</w:t>
             </w:r>
           </w:p>
         </w:tc>
@@ -2795,7 +2583,7 @@
           <w:p>
             <w:pPr/>
             <w:r>
-              <w:t xml:space="preserve">2 150 000</w:t>
+              <w:t xml:space="preserve">40 500</w:t>
             </w:r>
           </w:p>
         </w:tc>
@@ -2852,7 +2640,7 @@
           <w:p>
             <w:pPr/>
             <w:r>
-              <w:t xml:space="preserve">3 700 000</w:t>
+              <w:t xml:space="preserve">69 000</w:t>
             </w:r>
           </w:p>
         </w:tc>
@@ -2909,7 +2697,7 @@
           <w:p>
             <w:pPr/>
             <w:r>
-              <w:t xml:space="preserve">2 975 000</w:t>
+              <w:t xml:space="preserve">56 000</w:t>
             </w:r>
           </w:p>
         </w:tc>
@@ -2966,7 +2754,7 @@
           <w:p>
             <w:pPr/>
             <w:r>
-              <w:t xml:space="preserve">2 350 000</w:t>
+              <w:t xml:space="preserve">44 000</w:t>
             </w:r>
           </w:p>
         </w:tc>
@@ -3023,7 +2811,7 @@
           <w:p>
             <w:pPr/>
             <w:r>
-              <w:t xml:space="preserve">2 100 000</w:t>
+              <w:t xml:space="preserve">39 500</w:t>
             </w:r>
           </w:p>
         </w:tc>
@@ -3080,7 +2868,7 @@
           <w:p>
             <w:pPr/>
             <w:r>
-              <w:t xml:space="preserve">1 325 000</w:t>
+              <w:t xml:space="preserve">25 000</w:t>
             </w:r>
           </w:p>
         </w:tc>
@@ -3137,7 +2925,7 @@
           <w:p>
             <w:pPr/>
             <w:r>
-              <w:t xml:space="preserve">875 000</w:t>
+              <w:t xml:space="preserve">16 500</w:t>
             </w:r>
           </w:p>
         </w:tc>
@@ -3194,7 +2982,7 @@
           <w:p>
             <w:pPr/>
             <w:r>
-              <w:t xml:space="preserve">1 050 000</w:t>
+              <w:t xml:space="preserve">19 500</w:t>
             </w:r>
           </w:p>
         </w:tc>
@@ -3260,7 +3048,7 @@
               <w:rPr>
                 <w:b/>
               </w:rPr>
-              <w:t xml:space="preserve">3 125 000</w:t>
+              <w:t xml:space="preserve">59 000</w:t>
             </w:r>
           </w:p>
         </w:tc>
@@ -3317,7 +3105,7 @@
           <w:p>
             <w:pPr/>
             <w:r>
-              <w:t xml:space="preserve">1 200 000</w:t>
+              <w:t xml:space="preserve">22 500</w:t>
             </w:r>
           </w:p>
         </w:tc>
@@ -3374,7 +3162,7 @@
           <w:p>
             <w:pPr/>
             <w:r>
-              <w:t xml:space="preserve">525 000</w:t>
+              <w:t xml:space="preserve">10 000</w:t>
             </w:r>
           </w:p>
         </w:tc>
@@ -3431,7 +3219,7 @@
           <w:p>
             <w:pPr/>
             <w:r>
-              <w:t xml:space="preserve">1 400 000</w:t>
+              <w:t xml:space="preserve">26 500</w:t>
             </w:r>
           </w:p>
         </w:tc>
@@ -3497,7 +3285,7 @@
               <w:rPr>
                 <w:b/>
               </w:rPr>
-              <w:t xml:space="preserve">2 125 000</w:t>
+              <w:t xml:space="preserve">40 000</w:t>
             </w:r>
           </w:p>
         </w:tc>
@@ -3554,7 +3342,7 @@
           <w:p>
             <w:pPr/>
             <w:r>
-              <w:t xml:space="preserve">525 000</w:t>
+              <w:t xml:space="preserve">10 000</w:t>
             </w:r>
           </w:p>
         </w:tc>
@@ -3611,7 +3399,7 @@
           <w:p>
             <w:pPr/>
             <w:r>
-              <w:t xml:space="preserve">350 000</w:t>
+              <w:t xml:space="preserve">6 500</w:t>
             </w:r>
           </w:p>
         </w:tc>
@@ -3668,7 +3456,7 @@
           <w:p>
             <w:pPr/>
             <w:r>
-              <w:t xml:space="preserve">800 000</w:t>
+              <w:t xml:space="preserve">15 000</w:t>
             </w:r>
           </w:p>
         </w:tc>
@@ -3725,7 +3513,7 @@
           <w:p>
             <w:pPr/>
             <w:r>
-              <w:t xml:space="preserve">450 000</w:t>
+              <w:t xml:space="preserve">8 500</w:t>
             </w:r>
           </w:p>
         </w:tc>
@@ -3797,7 +3585,7 @@
               <w:rPr>
                 <w:b/>
               </w:rPr>
-              <w:t xml:space="preserve">2 400 000</w:t>
+              <w:t xml:space="preserve">45 000</w:t>
             </w:r>
           </w:p>
         </w:tc>
@@ -3819,9 +3607,8 @@
         <w:tblLook w:val="04A0" w:firstRow="1" w:lastRow="0" w:firstColumn="0" w:lastColumn="0" w:noHBand="0" w:noVBand="1"/>
       </w:tblPr>
       <w:tblGrid>
-        <w:gridCol w:w="3120"/>
-        <w:gridCol w:w="3120"/>
-        <w:gridCol w:w="3120"/>
+        <w:gridCol w:w="4680"/>
+        <w:gridCol w:w="4680"/>
       </w:tblGrid>
       <w:tr>
         <w:trPr>
@@ -3829,7 +3616,7 @@
         </w:trPr>
         <w:tc>
           <w:tcPr>
-            <w:tcW w:w="3120" w:type="dxa"/>
+            <w:tcW w:w="4680" w:type="dxa"/>
             <w:shd w:val="clear" w:color="auto" w:fill="F2F2F2"/>
           </w:tcPr>
           <w:p>
@@ -3841,7 +3628,7 @@
         </w:tc>
         <w:tc>
           <w:tcPr>
-            <w:tcW w:w="3120" w:type="dxa"/>
+            <w:tcW w:w="4680" w:type="dxa"/>
             <w:shd w:val="clear" w:color="auto" w:fill="F2F2F2"/>
           </w:tcPr>
           <w:p>
@@ -3851,23 +3638,11 @@
             </w:r>
           </w:p>
         </w:tc>
-        <w:tc>
-          <w:tcPr>
-            <w:tcW w:w="3120" w:type="dxa"/>
-            <w:shd w:val="clear" w:color="auto" w:fill="F2F2F2"/>
-          </w:tcPr>
-          <w:p>
-            <w:pPr/>
-            <w:r>
-              <w:t xml:space="preserve">Contre-valeur (EUR)</w:t>
-            </w:r>
-          </w:p>
-        </w:tc>
-      </w:tr>
-      <w:tr>
-        <w:tc>
-          <w:tcPr>
-            <w:tcW w:w="3120" w:type="dxa"/>
+      </w:tr>
+      <w:tr>
+        <w:tc>
+          <w:tcPr>
+            <w:tcW w:w="4680" w:type="dxa"/>
           </w:tcPr>
           <w:p>
             <w:pPr/>
@@ -3878,31 +3653,20 @@
         </w:tc>
         <w:tc>
           <w:tcPr>
-            <w:tcW w:w="3120" w:type="dxa"/>
-          </w:tcPr>
-          <w:p>
-            <w:pPr/>
-            <w:r>
-              <w:t xml:space="preserve">4 100 000</w:t>
-            </w:r>
-          </w:p>
-        </w:tc>
-        <w:tc>
-          <w:tcPr>
-            <w:tcW w:w="3120" w:type="dxa"/>
-          </w:tcPr>
-          <w:p>
-            <w:pPr/>
-            <w:r>
-              <w:t xml:space="preserve">6 250</w:t>
-            </w:r>
-          </w:p>
-        </w:tc>
-      </w:tr>
-      <w:tr>
-        <w:tc>
-          <w:tcPr>
-            <w:tcW w:w="3120" w:type="dxa"/>
+            <w:tcW w:w="4680" w:type="dxa"/>
+          </w:tcPr>
+          <w:p>
+            <w:pPr/>
+            <w:r>
+              <w:t xml:space="preserve">76 500</w:t>
+            </w:r>
+          </w:p>
+        </w:tc>
+      </w:tr>
+      <w:tr>
+        <w:tc>
+          <w:tcPr>
+            <w:tcW w:w="4680" w:type="dxa"/>
           </w:tcPr>
           <w:p>
             <w:pPr/>
@@ -3913,31 +3677,20 @@
         </w:tc>
         <w:tc>
           <w:tcPr>
-            <w:tcW w:w="3120" w:type="dxa"/>
-          </w:tcPr>
-          <w:p>
-            <w:pPr/>
-            <w:r>
-              <w:t xml:space="preserve">17 575 000</w:t>
-            </w:r>
-          </w:p>
-        </w:tc>
-        <w:tc>
-          <w:tcPr>
-            <w:tcW w:w="3120" w:type="dxa"/>
-          </w:tcPr>
-          <w:p>
-            <w:pPr/>
-            <w:r>
-              <w:t xml:space="preserve">26 793</w:t>
-            </w:r>
-          </w:p>
-        </w:tc>
-      </w:tr>
-      <w:tr>
-        <w:tc>
-          <w:tcPr>
-            <w:tcW w:w="3120" w:type="dxa"/>
+            <w:tcW w:w="4680" w:type="dxa"/>
+          </w:tcPr>
+          <w:p>
+            <w:pPr/>
+            <w:r>
+              <w:t xml:space="preserve">329 500</w:t>
+            </w:r>
+          </w:p>
+        </w:tc>
+      </w:tr>
+      <w:tr>
+        <w:tc>
+          <w:tcPr>
+            <w:tcW w:w="4680" w:type="dxa"/>
           </w:tcPr>
           <w:p>
             <w:pPr/>
@@ -3948,31 +3701,20 @@
         </w:tc>
         <w:tc>
           <w:tcPr>
-            <w:tcW w:w="3120" w:type="dxa"/>
-          </w:tcPr>
-          <w:p>
-            <w:pPr/>
-            <w:r>
-              <w:t xml:space="preserve">3 125 000</w:t>
-            </w:r>
-          </w:p>
-        </w:tc>
-        <w:tc>
-          <w:tcPr>
-            <w:tcW w:w="3120" w:type="dxa"/>
-          </w:tcPr>
-          <w:p>
-            <w:pPr/>
-            <w:r>
-              <w:t xml:space="preserve">4 764</w:t>
-            </w:r>
-          </w:p>
-        </w:tc>
-      </w:tr>
-      <w:tr>
-        <w:tc>
-          <w:tcPr>
-            <w:tcW w:w="3120" w:type="dxa"/>
+            <w:tcW w:w="4680" w:type="dxa"/>
+          </w:tcPr>
+          <w:p>
+            <w:pPr/>
+            <w:r>
+              <w:t xml:space="preserve">59 000</w:t>
+            </w:r>
+          </w:p>
+        </w:tc>
+      </w:tr>
+      <w:tr>
+        <w:tc>
+          <w:tcPr>
+            <w:tcW w:w="4680" w:type="dxa"/>
           </w:tcPr>
           <w:p>
             <w:pPr/>
@@ -3983,31 +3725,20 @@
         </w:tc>
         <w:tc>
           <w:tcPr>
-            <w:tcW w:w="3120" w:type="dxa"/>
-          </w:tcPr>
-          <w:p>
-            <w:pPr/>
-            <w:r>
-              <w:t xml:space="preserve">2 125 000</w:t>
-            </w:r>
-          </w:p>
-        </w:tc>
-        <w:tc>
-          <w:tcPr>
-            <w:tcW w:w="3120" w:type="dxa"/>
-          </w:tcPr>
-          <w:p>
-            <w:pPr/>
-            <w:r>
-              <w:t xml:space="preserve">3 240</w:t>
-            </w:r>
-          </w:p>
-        </w:tc>
-      </w:tr>
-      <w:tr>
-        <w:tc>
-          <w:tcPr>
-            <w:tcW w:w="3120" w:type="dxa"/>
+            <w:tcW w:w="4680" w:type="dxa"/>
+          </w:tcPr>
+          <w:p>
+            <w:pPr/>
+            <w:r>
+              <w:t xml:space="preserve">40 000</w:t>
+            </w:r>
+          </w:p>
+        </w:tc>
+      </w:tr>
+      <w:tr>
+        <w:tc>
+          <w:tcPr>
+            <w:tcW w:w="4680" w:type="dxa"/>
           </w:tcPr>
           <w:p>
             <w:pPr/>
@@ -4018,31 +3749,20 @@
         </w:tc>
         <w:tc>
           <w:tcPr>
-            <w:tcW w:w="3120" w:type="dxa"/>
-          </w:tcPr>
-          <w:p>
-            <w:pPr/>
-            <w:r>
-              <w:t xml:space="preserve">2 400 000</w:t>
-            </w:r>
-          </w:p>
-        </w:tc>
-        <w:tc>
-          <w:tcPr>
-            <w:tcW w:w="3120" w:type="dxa"/>
-          </w:tcPr>
-          <w:p>
-            <w:pPr/>
-            <w:r>
-              <w:t xml:space="preserve">3 659</w:t>
-            </w:r>
-          </w:p>
-        </w:tc>
-      </w:tr>
-      <w:tr>
-        <w:tc>
-          <w:tcPr>
-            <w:tcW w:w="3120" w:type="dxa"/>
+            <w:tcW w:w="4680" w:type="dxa"/>
+          </w:tcPr>
+          <w:p>
+            <w:pPr/>
+            <w:r>
+              <w:t xml:space="preserve">45 000</w:t>
+            </w:r>
+          </w:p>
+        </w:tc>
+      </w:tr>
+      <w:tr>
+        <w:tc>
+          <w:tcPr>
+            <w:tcW w:w="4680" w:type="dxa"/>
           </w:tcPr>
           <w:p>
             <w:pPr/>
@@ -4056,7 +3776,7 @@
         </w:tc>
         <w:tc>
           <w:tcPr>
-            <w:tcW w:w="3120" w:type="dxa"/>
+            <w:tcW w:w="4680" w:type="dxa"/>
           </w:tcPr>
           <w:p>
             <w:pPr/>
@@ -4064,29 +3784,15 @@
               <w:rPr>
                 <w:b/>
               </w:rPr>
-              <w:t xml:space="preserve">29 325 000</w:t>
-            </w:r>
-          </w:p>
-        </w:tc>
-        <w:tc>
-          <w:tcPr>
-            <w:tcW w:w="3120" w:type="dxa"/>
-          </w:tcPr>
-          <w:p>
-            <w:pPr/>
-            <w:r>
-              <w:rPr>
-                <w:b/>
-              </w:rPr>
-              <w:t xml:space="preserve">44 706</w:t>
-            </w:r>
-          </w:p>
-        </w:tc>
-      </w:tr>
-      <w:tr>
-        <w:tc>
-          <w:tcPr>
-            <w:tcW w:w="3120" w:type="dxa"/>
+              <w:t xml:space="preserve">550 000</w:t>
+            </w:r>
+          </w:p>
+        </w:tc>
+      </w:tr>
+      <w:tr>
+        <w:tc>
+          <w:tcPr>
+            <w:tcW w:w="4680" w:type="dxa"/>
           </w:tcPr>
           <w:p>
             <w:pPr/>
@@ -4097,31 +3803,20 @@
         </w:tc>
         <w:tc>
           <w:tcPr>
-            <w:tcW w:w="3120" w:type="dxa"/>
-          </w:tcPr>
-          <w:p>
-            <w:pPr/>
-            <w:r>
-              <w:t xml:space="preserve">5 278 500</w:t>
-            </w:r>
-          </w:p>
-        </w:tc>
-        <w:tc>
-          <w:tcPr>
-            <w:tcW w:w="3120" w:type="dxa"/>
-          </w:tcPr>
-          <w:p>
-            <w:pPr/>
-            <w:r>
-              <w:t xml:space="preserve">8 047</w:t>
-            </w:r>
-          </w:p>
-        </w:tc>
-      </w:tr>
-      <w:tr>
-        <w:tc>
-          <w:tcPr>
-            <w:tcW w:w="3120" w:type="dxa"/>
+            <w:tcW w:w="4680" w:type="dxa"/>
+          </w:tcPr>
+          <w:p>
+            <w:pPr/>
+            <w:r>
+              <w:t xml:space="preserve">99 000</w:t>
+            </w:r>
+          </w:p>
+        </w:tc>
+      </w:tr>
+      <w:tr>
+        <w:tc>
+          <w:tcPr>
+            <w:tcW w:w="4680" w:type="dxa"/>
           </w:tcPr>
           <w:p>
             <w:pPr/>
@@ -4135,7 +3830,7 @@
         </w:tc>
         <w:tc>
           <w:tcPr>
-            <w:tcW w:w="3120" w:type="dxa"/>
+            <w:tcW w:w="4680" w:type="dxa"/>
           </w:tcPr>
           <w:p>
             <w:pPr/>
@@ -4143,21 +3838,7 @@
               <w:rPr>
                 <w:b/>
               </w:rPr>
-              <w:t xml:space="preserve">34 603 500</w:t>
-            </w:r>
-          </w:p>
-        </w:tc>
-        <w:tc>
-          <w:tcPr>
-            <w:tcW w:w="3120" w:type="dxa"/>
-          </w:tcPr>
-          <w:p>
-            <w:pPr/>
-            <w:r>
-              <w:rPr>
-                <w:b/>
-              </w:rPr>
-              <w:t xml:space="preserve">52 753</w:t>
+              <w:t xml:space="preserve">649 000</w:t>
             </w:r>
           </w:p>
         </w:tc>
@@ -4166,7 +3847,7 @@
     <w:p>
       <w:pPr/>
       <w:r>
-        <w:t xml:space="preserve">Les montants en euros sont indicatifs (parité fixe 1 EUR = 655,957 FCFA) ; seul le montant en FCFA fait foi.</w:t>
+        <w:t xml:space="preserve">Contre-valeur indicative : 838 EUR HT, 989 EUR TTC (parité fixe 1 EUR = 655,957 FCFA) ; seul le montant en FCFA fait foi.</w:t>
       </w:r>
     </w:p>
     <w:p>
@@ -4311,18 +3992,18 @@
           <w:p>
             <w:pPr/>
             <w:r>
-              <w:t xml:space="preserve">11 730 000</w:t>
-            </w:r>
-          </w:p>
-        </w:tc>
-        <w:tc>
-          <w:tcPr>
-            <w:tcW w:w="1872" w:type="dxa"/>
-          </w:tcPr>
-          <w:p>
-            <w:pPr/>
-            <w:r>
-              <w:t xml:space="preserve">13 841 400</w:t>
+              <w:t xml:space="preserve">220 000</w:t>
+            </w:r>
+          </w:p>
+        </w:tc>
+        <w:tc>
+          <w:tcPr>
+            <w:tcW w:w="1872" w:type="dxa"/>
+          </w:tcPr>
+          <w:p>
+            <w:pPr/>
+            <w:r>
+              <w:t xml:space="preserve">259 600</w:t>
             </w:r>
           </w:p>
         </w:tc>
@@ -4368,18 +4049,18 @@
           <w:p>
             <w:pPr/>
             <w:r>
-              <w:t xml:space="preserve">11 730 000</w:t>
-            </w:r>
-          </w:p>
-        </w:tc>
-        <w:tc>
-          <w:tcPr>
-            <w:tcW w:w="1872" w:type="dxa"/>
-          </w:tcPr>
-          <w:p>
-            <w:pPr/>
-            <w:r>
-              <w:t xml:space="preserve">13 841 400</w:t>
+              <w:t xml:space="preserve">220 000</w:t>
+            </w:r>
+          </w:p>
+        </w:tc>
+        <w:tc>
+          <w:tcPr>
+            <w:tcW w:w="1872" w:type="dxa"/>
+          </w:tcPr>
+          <w:p>
+            <w:pPr/>
+            <w:r>
+              <w:t xml:space="preserve">259 600</w:t>
             </w:r>
           </w:p>
         </w:tc>
@@ -4425,18 +4106,18 @@
           <w:p>
             <w:pPr/>
             <w:r>
-              <w:t xml:space="preserve">5 865 000</w:t>
-            </w:r>
-          </w:p>
-        </w:tc>
-        <w:tc>
-          <w:tcPr>
-            <w:tcW w:w="1872" w:type="dxa"/>
-          </w:tcPr>
-          <w:p>
-            <w:pPr/>
-            <w:r>
-              <w:t xml:space="preserve">6 920 700</w:t>
+              <w:t xml:space="preserve">110 000</w:t>
+            </w:r>
+          </w:p>
+        </w:tc>
+        <w:tc>
+          <w:tcPr>
+            <w:tcW w:w="1872" w:type="dxa"/>
+          </w:tcPr>
+          <w:p>
+            <w:pPr/>
+            <w:r>
+              <w:t xml:space="preserve">129 800</w:t>
             </w:r>
           </w:p>
         </w:tc>
@@ -4488,7 +4169,7 @@
               <w:rPr>
                 <w:b/>
               </w:rPr>
-              <w:t xml:space="preserve">29 325 000</w:t>
+              <w:t xml:space="preserve">550 000</w:t>
             </w:r>
           </w:p>
         </w:tc>
@@ -4502,7 +4183,7 @@
               <w:rPr>
                 <w:b/>
               </w:rPr>
-              <w:t xml:space="preserve">34 603 500</w:t>
+              <w:t xml:space="preserve">649 000</w:t>
             </w:r>
           </w:p>
         </w:tc>
@@ -4808,7 +4489,7 @@
         <w:rPr>
           <w:b/>
         </w:rPr>
-        <w:t xml:space="preserve">350 000 FCFA HT/mois</w:t>
+        <w:t xml:space="preserve">6 500 FCFA HT/mois</w:t>
       </w:r>
       <w:r>
         <w:t xml:space="preserve"> (engagement 12 mois) comprenant correctifs, mises à jour de sécurité, sauvegardes supervisées, compatibilité nouvelles versions Android/iOS et 2 jours d'évolutions mineures par mois.</w:t>
@@ -5041,7 +4722,7 @@
           <w:p>
             <w:pPr/>
             <w:r>
-              <w:t xml:space="preserve">1 750 000</w:t>
+              <w:t xml:space="preserve">33 000</w:t>
             </w:r>
           </w:p>
         </w:tc>
@@ -5087,7 +4768,7 @@
           <w:p>
             <w:pPr/>
             <w:r>
-              <w:t xml:space="preserve">525 000</w:t>
+              <w:t xml:space="preserve">10 000</w:t>
             </w:r>
           </w:p>
         </w:tc>
@@ -5133,7 +4814,7 @@
           <w:p>
             <w:pPr/>
             <w:r>
-              <w:t xml:space="preserve">875 000</w:t>
+              <w:t xml:space="preserve">16 500</w:t>
             </w:r>
           </w:p>
         </w:tc>
@@ -5179,7 +4860,7 @@
           <w:p>
             <w:pPr/>
             <w:r>
-              <w:t xml:space="preserve">1 050 000</w:t>
+              <w:t xml:space="preserve">19 500</w:t>
             </w:r>
           </w:p>
         </w:tc>
@@ -5225,7 +4906,7 @@
           <w:p>
             <w:pPr/>
             <w:r>
-              <w:t xml:space="preserve">600 000</w:t>
+              <w:t xml:space="preserve">11 000</w:t>
             </w:r>
           </w:p>
         </w:tc>

</xml_diff>

<commit_message>
docs: devis ramené à une durée de 2 mois (8 semaines)
Co-Authored-By: Claude Opus 5.5 <noreply@anthropic.com>
Claude-Session: https://claude.ai/code/session_01CG3dz7AHdi9j6oqdbyU82n
</commit_message>
<xml_diff>
--- a/docs/devis/Devis_Plateforme_Engins_Poids_Lourds.docx
+++ b/docs/devis/Devis_Plateforme_Engins_Poids_Lourds.docx
@@ -48,7 +48,7 @@
         <w:rPr>
           <w:b/>
         </w:rPr>
-        <w:t xml:space="preserve">18 semaines</w:t>
+        <w:t xml:space="preserve">8 semaines (2 mois)</w:t>
       </w:r>
       <w:r>
         <w:t xml:space="preserve">.</w:t>
@@ -1730,10 +1730,10 @@
         <w:rPr>
           <w:b/>
         </w:rPr>
-        <w:t xml:space="preserve">18 semaines</w:t>
-      </w:r>
-      <w:r>
-        <w:t xml:space="preserve"> (environ 4 mois et demi) avec une équipe de 5 personnes ; la version bêta est livrée en fin de semaine 13.</w:t>
+        <w:t xml:space="preserve">8 semaines (2 mois)</w:t>
+      </w:r>
+      <w:r>
+        <w:t xml:space="preserve"> avec une équipe renforcée de 7 personnes travaillant en parallèle ; la version bêta est livrée en fin de semaine 6.</w:t>
       </w:r>
     </w:p>
     <w:p>
@@ -1869,7 +1869,7 @@
           <w:p>
             <w:pPr/>
             <w:r>
-              <w:t xml:space="preserve">S1–S3</w:t>
+              <w:t xml:space="preserve">S1–S2</w:t>
             </w:r>
           </w:p>
         </w:tc>
@@ -1891,7 +1891,7 @@
           <w:p>
             <w:pPr/>
             <w:r>
-              <w:t xml:space="preserve">Validation des spécifications et des maquettes</w:t>
+              <w:t xml:space="preserve">Validation des spécifications et des maquettes sous 3 jours ouvrés</w:t>
             </w:r>
           </w:p>
         </w:tc>
@@ -1915,18 +1915,18 @@
           <w:p>
             <w:pPr/>
             <w:r>
-              <w:t xml:space="preserve">S4–S13</w:t>
-            </w:r>
-          </w:p>
-        </w:tc>
-        <w:tc>
-          <w:tcPr>
-            <w:tcW w:w="2340" w:type="dxa"/>
-          </w:tcPr>
-          <w:p>
-            <w:pPr/>
-            <w:r>
-              <w:t xml:space="preserve">Livraisons toutes les 2 semaines (sprints) sur un serveur de test, puis version bêta complète</w:t>
+              <w:t xml:space="preserve">S3–S6</w:t>
+            </w:r>
+          </w:p>
+        </w:tc>
+        <w:tc>
+          <w:tcPr>
+            <w:tcW w:w="2340" w:type="dxa"/>
+          </w:tcPr>
+          <w:p>
+            <w:pPr/>
+            <w:r>
+              <w:t xml:space="preserve">2 sprints de 2 semaines livrés sur un serveur de test, puis version bêta complète</w:t>
             </w:r>
           </w:p>
         </w:tc>
@@ -1961,7 +1961,7 @@
           <w:p>
             <w:pPr/>
             <w:r>
-              <w:t xml:space="preserve">S14–S16</w:t>
+              <w:t xml:space="preserve">S7</w:t>
             </w:r>
           </w:p>
         </w:tc>
@@ -2007,7 +2007,7 @@
           <w:p>
             <w:pPr/>
             <w:r>
-              <w:t xml:space="preserve">S17–S18</w:t>
+              <w:t xml:space="preserve">S8</w:t>
             </w:r>
           </w:p>
         </w:tc>
@@ -2044,7 +2044,7 @@
         <w:t xml:space="preserve">Équipe mobilisée</w:t>
       </w:r>
       <w:r>
-        <w:t xml:space="preserve"> : 1 chef de projet / BA, 1 développeur backend senior, 1 développeur frontend web, 1 développeur Flutter, 1 designer UI/UX (phase 1), plus un testeur QA et un DevOps ponctuellement.</w:t>
+        <w:t xml:space="preserve"> : 1 chef de projet / BA, 2 développeurs backend, 1 développeur frontend web, 2 développeurs Flutter, 1 designer UI/UX (phase 1), plus un testeur QA et un DevOps ponctuellement. Ce délai suppose que le client valide les maquettes et la recette sous 3 jours ouvrés.</w:t>
       </w:r>
     </w:p>
     <w:p>
@@ -4027,7 +4027,7 @@
           <w:p>
             <w:pPr/>
             <w:r>
-              <w:t xml:space="preserve">Livraison de la version bêta (fin de phase 2, semaine 13)</w:t>
+              <w:t xml:space="preserve">Livraison de la version bêta (fin de phase 2, semaine 6)</w:t>
             </w:r>
           </w:p>
         </w:tc>
@@ -4084,7 +4084,7 @@
           <w:p>
             <w:pPr/>
             <w:r>
-              <w:t xml:space="preserve">Mise en production et PV de réception finale (semaine 18)</w:t>
+              <w:t xml:space="preserve">Mise en production et PV de réception finale (semaine 8)</w:t>
             </w:r>
           </w:p>
         </w:tc>

</xml_diff>

<commit_message>
docs: légende du planning alignée sur 8 semaines
Co-Authored-By: Claude Opus 5.5 <noreply@anthropic.com>
Claude-Session: https://claude.ai/code/session_01CG3dz7AHdi9j6oqdbyU82n
</commit_message>
<xml_diff>
--- a/docs/devis/Devis_Plateforme_Engins_Poids_Lourds.docx
+++ b/docs/devis/Devis_Plateforme_Engins_Poids_Lourds.docx
@@ -1742,12 +1742,12 @@
         <w:drawing>
           <wp:inline distT="0" distB="0" distL="0" distR="0">
             <wp:extent cx="5486400" cy="2596242"/>
-            <wp:docPr id="2" name="image2" descr="planning estimatif · 4 phases, 18 semaines, 3 jalons de paiement"/>
+            <wp:docPr id="2" name="image2" descr="planning estimatif · 4 phases, 8 semaines, 3 jalons de paiement"/>
             <a:graphic xmlns:a="http://schemas.openxmlformats.org/drawingml/2006/main">
               <a:graphicData uri="http://schemas.openxmlformats.org/drawingml/2006/picture">
                 <pic:pic xmlns:pic="http://schemas.openxmlformats.org/drawingml/2006/picture">
                   <pic:nvPicPr>
-                    <pic:cNvPr id="2" name="image2" descr="planning estimatif · 4 phases, 18 semaines, 3 jalons de paiement"/>
+                    <pic:cNvPr id="2" name="image2" descr="planning estimatif · 4 phases, 8 semaines, 3 jalons de paiement"/>
                     <pic:cNvPicPr/>
                   </pic:nvPicPr>
                   <pic:blipFill>
@@ -1775,7 +1775,7 @@
     <w:p>
       <w:pPr/>
       <w:r>
-        <w:t xml:space="preserve">planning estimatif · 4 phases, 18 semaines, 3 jalons de paiement</w:t>
+        <w:t xml:space="preserve">planning estimatif · 4 phases, 8 semaines, 3 jalons de paiement</w:t>
       </w:r>
     </w:p>
     <w:p>

</xml_diff>

<commit_message>
docs: devis recentré sur une plateforme web seule (mobile en option)
Co-Authored-By: Claude Opus 5.5 <noreply@anthropic.com>
Claude-Session: https://claude.ai/code/session_01CG3dz7AHdi9j6oqdbyU82n
</commit_message>
<xml_diff>
--- a/docs/devis/Devis_Plateforme_Engins_Poids_Lourds.docx
+++ b/docs/devis/Devis_Plateforme_Engins_Poids_Lourds.docx
@@ -113,7 +113,7 @@
           <w:p>
             <w:pPr/>
             <w:r>
-              <w:t xml:space="preserve">Conception, développement et déploiement d'une plateforme web + mobile de gestion des engins poids lourds</w:t>
+              <w:t xml:space="preserve">Conception, développement et déploiement d'une plateforme web de gestion des engins poids lourds</w:t>
             </w:r>
           </w:p>
         </w:tc>
@@ -257,7 +257,7 @@
           <w:p>
             <w:pPr/>
             <w:r>
-              <w:t xml:space="preserve">Application web (back-office), application mobile Android/iOS (Flutter), API REST, documentation, formation</w:t>
+              <w:t xml:space="preserve">Application web responsive (ordinateur, tablette, smartphone), documentation, formation</w:t>
             </w:r>
           </w:p>
         </w:tc>
@@ -382,7 +382,7 @@
         <w:t xml:space="preserve">Tracer</w:t>
       </w:r>
       <w:r>
-        <w:t xml:space="preserve"> chaque mission, chaque plein et chaque intervention depuis le terrain, via le mobile, y compris hors connexion.</w:t>
+        <w:t xml:space="preserve"> chaque mission, chaque plein et chaque intervention depuis le terrain, via le navigateur du téléphone, sans application à installer.</w:t>
       </w:r>
     </w:p>
     <w:p>
@@ -450,12 +450,12 @@
         <w:drawing>
           <wp:inline distT="0" distB="0" distL="0" distR="0">
             <wp:extent cx="5486400" cy="2359478"/>
-            <wp:docPr id="1" name="image1" descr="architecture cible · 2 applications, 1 API, 3 services"/>
+            <wp:docPr id="1" name="image1" descr="architecture cible · 1 application web, 3 services"/>
             <a:graphic xmlns:a="http://schemas.openxmlformats.org/drawingml/2006/main">
               <a:graphicData uri="http://schemas.openxmlformats.org/drawingml/2006/picture">
                 <pic:pic xmlns:pic="http://schemas.openxmlformats.org/drawingml/2006/picture">
                   <pic:nvPicPr>
-                    <pic:cNvPr id="1" name="image1" descr="architecture cible · 2 applications, 1 API, 3 services"/>
+                    <pic:cNvPr id="1" name="image1" descr="architecture cible · 1 application web, 3 services"/>
                     <pic:cNvPicPr/>
                   </pic:nvPicPr>
                   <pic:blipFill>
@@ -483,13 +483,13 @@
     <w:p>
       <w:pPr/>
       <w:r>
-        <w:t xml:space="preserve">architecture cible · 2 applications, 1 API, 3 services</w:t>
+        <w:t xml:space="preserve">architecture cible · 1 application web, 3 services</w:t>
       </w:r>
     </w:p>
     <w:p>
       <w:pPr/>
       <w:r>
-        <w:t xml:space="preserve">Le web et le mobile consomment la même API : une règle métier (ex. seuil de surconsommation) n'est écrite qu'une fois.</w:t>
+        <w:t xml:space="preserve">Une seule application web responsive sert tous les profils : les chauffeurs et mécaniciens saisissent depuis le navigateur de leur téléphone, sans rien installer. Une connexion internet est nécessaire pour la saisie.</w:t>
       </w:r>
     </w:p>
     <w:tbl>
@@ -553,7 +553,7 @@
           <w:p>
             <w:pPr/>
             <w:r>
-              <w:t xml:space="preserve">Backend / API</w:t>
+              <w:t xml:space="preserve">Backend</w:t>
             </w:r>
           </w:p>
         </w:tc>
@@ -564,7 +564,7 @@
           <w:p>
             <w:pPr/>
             <w:r>
-              <w:t xml:space="preserve">Laravel 11, API REST JSON, Laravel Sanctum</w:t>
+              <w:t xml:space="preserve">Laravel 11, Laravel Sanctum</w:t>
             </w:r>
           </w:p>
         </w:tc>
@@ -599,7 +599,7 @@
           <w:p>
             <w:pPr/>
             <w:r>
-              <w:t xml:space="preserve">Vue 3 (via Inertia) + Tailwind CSS</w:t>
+              <w:t xml:space="preserve">Vue 3 (via Inertia) + Tailwind CSS, interface responsive</w:t>
             </w:r>
           </w:p>
         </w:tc>
@@ -610,7 +610,7 @@
           <w:p>
             <w:pPr/>
             <w:r>
-              <w:t xml:space="preserve">Interfaces réactives (planning, tableaux de bord) sans API séparée côté web</w:t>
+              <w:t xml:space="preserve">Interfaces réactives (planning, tableaux de bord) utilisables sur ordinateur, tablette et smartphone</w:t>
             </w:r>
           </w:p>
         </w:tc>
@@ -623,7 +623,7 @@
           <w:p>
             <w:pPr/>
             <w:r>
-              <w:t xml:space="preserve">Mobile</w:t>
+              <w:t xml:space="preserve">Base de données</w:t>
             </w:r>
           </w:p>
         </w:tc>
@@ -634,7 +634,7 @@
           <w:p>
             <w:pPr/>
             <w:r>
-              <w:t xml:space="preserve">Flutter (Android + iOS), base locale SQLite</w:t>
+              <w:t xml:space="preserve">PostgreSQL (ou MySQL selon l'existant du client)</w:t>
             </w:r>
           </w:p>
         </w:tc>
@@ -645,7 +645,7 @@
           <w:p>
             <w:pPr/>
             <w:r>
-              <w:t xml:space="preserve">Une seule base de code, fonctionnement hors-ligne sur chantier</w:t>
+              <w:t xml:space="preserve">Fiabilité, requêtes de reporting</w:t>
             </w:r>
           </w:p>
         </w:tc>
@@ -658,7 +658,7 @@
           <w:p>
             <w:pPr/>
             <w:r>
-              <w:t xml:space="preserve">Base de données</w:t>
+              <w:t xml:space="preserve">Rôles &amp; droits</w:t>
             </w:r>
           </w:p>
         </w:tc>
@@ -669,7 +669,7 @@
           <w:p>
             <w:pPr/>
             <w:r>
-              <w:t xml:space="preserve">PostgreSQL (ou MySQL selon l'existant du client)</w:t>
+              <w:t xml:space="preserve">spatie/laravel-permission</w:t>
             </w:r>
           </w:p>
         </w:tc>
@@ -680,7 +680,7 @@
           <w:p>
             <w:pPr/>
             <w:r>
-              <w:t xml:space="preserve">Fiabilité, requêtes de reporting</w:t>
+              <w:t xml:space="preserve">Gestion fine des 4 rôles et des restrictions par site</w:t>
             </w:r>
           </w:p>
         </w:tc>
@@ -693,7 +693,7 @@
           <w:p>
             <w:pPr/>
             <w:r>
-              <w:t xml:space="preserve">Rôles &amp; droits</w:t>
+              <w:t xml:space="preserve">Exports</w:t>
             </w:r>
           </w:p>
         </w:tc>
@@ -704,7 +704,7 @@
           <w:p>
             <w:pPr/>
             <w:r>
-              <w:t xml:space="preserve">spatie/laravel-permission</w:t>
+              <w:t xml:space="preserve">DomPDF / Snappy (PDF), Laravel Excel (XLSX)</w:t>
             </w:r>
           </w:p>
         </w:tc>
@@ -715,7 +715,7 @@
           <w:p>
             <w:pPr/>
             <w:r>
-              <w:t xml:space="preserve">Gestion fine des 4 rôles et des restrictions par site</w:t>
+              <w:t xml:space="preserve">Rapports conformes aux modèles du client</w:t>
             </w:r>
           </w:p>
         </w:tc>
@@ -728,7 +728,7 @@
           <w:p>
             <w:pPr/>
             <w:r>
-              <w:t xml:space="preserve">Exports</w:t>
+              <w:t xml:space="preserve">Graphiques</w:t>
             </w:r>
           </w:p>
         </w:tc>
@@ -739,7 +739,7 @@
           <w:p>
             <w:pPr/>
             <w:r>
-              <w:t xml:space="preserve">DomPDF / Snappy (PDF), Laravel Excel (XLSX)</w:t>
+              <w:t xml:space="preserve">Chart.js ou ApexCharts</w:t>
             </w:r>
           </w:p>
         </w:tc>
@@ -750,7 +750,7 @@
           <w:p>
             <w:pPr/>
             <w:r>
-              <w:t xml:space="preserve">Rapports conformes aux modèles du client</w:t>
+              <w:t xml:space="preserve">Tableaux de bord lisibles sur ordinateur et tablette</w:t>
             </w:r>
           </w:p>
         </w:tc>
@@ -763,7 +763,7 @@
           <w:p>
             <w:pPr/>
             <w:r>
-              <w:t xml:space="preserve">Graphiques</w:t>
+              <w:t xml:space="preserve">Notifications</w:t>
             </w:r>
           </w:p>
         </w:tc>
@@ -774,7 +774,7 @@
           <w:p>
             <w:pPr/>
             <w:r>
-              <w:t xml:space="preserve">Chart.js ou ApexCharts</w:t>
+              <w:t xml:space="preserve">E-mails transactionnels (SMTP), alertes dans l'application</w:t>
             </w:r>
           </w:p>
         </w:tc>
@@ -785,7 +785,7 @@
           <w:p>
             <w:pPr/>
             <w:r>
-              <w:t xml:space="preserve">Tableaux de bord lisibles sur ordinateur et tablette</w:t>
+              <w:t xml:space="preserve">Aucun coût d'abonnement</w:t>
             </w:r>
           </w:p>
         </w:tc>
@@ -798,7 +798,7 @@
           <w:p>
             <w:pPr/>
             <w:r>
-              <w:t xml:space="preserve">Notifications</w:t>
+              <w:t xml:space="preserve">Infrastructure</w:t>
             </w:r>
           </w:p>
         </w:tc>
@@ -809,7 +809,7 @@
           <w:p>
             <w:pPr/>
             <w:r>
-              <w:t xml:space="preserve">Firebase Cloud Messaging, SMTP</w:t>
+              <w:t xml:space="preserve">Serveur cloud Linux, Docker, Nginx, CI/CD GitHub Actions</w:t>
             </w:r>
           </w:p>
         </w:tc>
@@ -820,47 +820,24 @@
           <w:p>
             <w:pPr/>
             <w:r>
-              <w:t xml:space="preserve">Push gratuit, e-mails transactionnels</w:t>
-            </w:r>
-          </w:p>
-        </w:tc>
-      </w:tr>
-      <w:tr>
-        <w:tc>
-          <w:tcPr>
-            <w:tcW w:w="3120" w:type="dxa"/>
-          </w:tcPr>
-          <w:p>
-            <w:pPr/>
-            <w:r>
-              <w:t xml:space="preserve">Infrastructure</w:t>
-            </w:r>
-          </w:p>
-        </w:tc>
-        <w:tc>
-          <w:tcPr>
-            <w:tcW w:w="3120" w:type="dxa"/>
-          </w:tcPr>
-          <w:p>
-            <w:pPr/>
-            <w:r>
-              <w:t xml:space="preserve">Serveur cloud Linux, Docker, Nginx, CI/CD GitHub Actions</w:t>
-            </w:r>
-          </w:p>
-        </w:tc>
-        <w:tc>
-          <w:tcPr>
-            <w:tcW w:w="3120" w:type="dxa"/>
-          </w:tcPr>
-          <w:p>
-            <w:pPr/>
-            <w:r>
               <w:t xml:space="preserve">Déploiements reproductibles, sauvegardes quotidiennes automatiques</w:t>
             </w:r>
           </w:p>
         </w:tc>
       </w:tr>
     </w:tbl>
+    <w:p>
+      <w:pPr/>
+      <w:r>
+        <w:rPr>
+          <w:b/>
+        </w:rPr>
+        <w:t xml:space="preserve">Évolutivité</w:t>
+      </w:r>
+      <w:r>
+        <w:t xml:space="preserve"> : le code est organisé pour exposer plus tard une API REST, si une application mobile est ajoutée (voir option O6).</w:t>
+      </w:r>
+    </w:p>
     <w:p>
       <w:pPr/>
       <w:r>
@@ -884,25 +861,7 @@
     <w:p>
       <w:pPr/>
       <w:r>
-        <w:t xml:space="preserve">Le périmètre couvre 6 modules métier et 2 briques transverses (alertes, mode hors-ligne). Chaque fonction indique où elle est disponible : </w:t>
-      </w:r>
-      <w:r>
-        <w:rPr>
-          <w:b/>
-        </w:rPr>
-        <w:t xml:space="preserve">W</w:t>
-      </w:r>
-      <w:r>
-        <w:t xml:space="preserve"> = application web, </w:t>
-      </w:r>
-      <w:r>
-        <w:rPr>
-          <w:b/>
-        </w:rPr>
-        <w:t xml:space="preserve">M</w:t>
-      </w:r>
-      <w:r>
-        <w:t xml:space="preserve"> = application mobile.</w:t>
+        <w:t xml:space="preserve">Le périmètre couvre 6 modules métier, tous accessibles depuis un navigateur web sur ordinateur, tablette ou smartphone (interface responsive, sans application à installer).</w:t>
       </w:r>
     </w:p>
     <w:p>
@@ -922,13 +881,7 @@
         </w:numPr>
       </w:pPr>
       <w:r>
-        <w:t xml:space="preserve">Fiche engin complète : type (camion, benne, tracteur, chargeuse…), marque, modèle, n° de châssis, immatriculation, année, compteur km et/ou horamètre, photos, statut (disponible, en mission, en panne, en maintenance, réformé). </w:t>
-      </w:r>
-      <w:r>
-        <w:rPr>
-          <w:b/>
-        </w:rPr>
-        <w:t xml:space="preserve">W / M (consultation)</w:t>
+        <w:t xml:space="preserve">Fiche engin complète : type (camion, benne, tracteur, chargeuse…), marque, modèle, n° de châssis, immatriculation, année, compteur km et/ou horamètre, photos, statut (disponible, en mission, en panne, en maintenance, réformé).</w:t>
       </w:r>
     </w:p>
     <w:p>
@@ -940,13 +893,7 @@
         </w:numPr>
       </w:pPr>
       <w:r>
-        <w:t xml:space="preserve">Gestion documentaire : carte grise, assurance, visite technique, vignette, patente/licence de transport, avec date d'expiration et pièce jointe (PDF, photo). </w:t>
-      </w:r>
-      <w:r>
-        <w:rPr>
-          <w:b/>
-        </w:rPr>
-        <w:t xml:space="preserve">W</w:t>
+        <w:t xml:space="preserve">Gestion documentaire : carte grise, assurance, visite technique, vignette, patente/licence de transport, avec date d'expiration et pièce jointe (PDF, photo).</w:t>
       </w:r>
     </w:p>
     <w:p>
@@ -958,13 +905,7 @@
         </w:numPr>
       </w:pPr>
       <w:r>
-        <w:t xml:space="preserve">Alertes d'échéance paramétrables (J-30, J-15, J-7) par e-mail et notification. </w:t>
-      </w:r>
-      <w:r>
-        <w:rPr>
-          <w:b/>
-        </w:rPr>
-        <w:t xml:space="preserve">W / M</w:t>
+        <w:t xml:space="preserve">Alertes d'échéance paramétrables (J-30, J-15, J-7) par e-mail et dans l'application.</w:t>
       </w:r>
     </w:p>
     <w:p>
@@ -976,13 +917,7 @@
         </w:numPr>
       </w:pPr>
       <w:r>
-        <w:t xml:space="preserve">Affectation d'un engin à un site ou à un dépôt, historique des affectations. </w:t>
-      </w:r>
-      <w:r>
-        <w:rPr>
-          <w:b/>
-        </w:rPr>
-        <w:t xml:space="preserve">W</w:t>
+        <w:t xml:space="preserve">Affectation d'un engin à un site ou à un dépôt, historique des affectations.</w:t>
       </w:r>
     </w:p>
     <w:p>
@@ -994,13 +929,7 @@
         </w:numPr>
       </w:pPr>
       <w:r>
-        <w:t xml:space="preserve">Import initial du parc depuis un fichier Excel. </w:t>
-      </w:r>
-      <w:r>
-        <w:rPr>
-          <w:b/>
-        </w:rPr>
-        <w:t xml:space="preserve">W</w:t>
+        <w:t xml:space="preserve">Import initial du parc depuis un fichier Excel.</w:t>
       </w:r>
     </w:p>
     <w:p>
@@ -1020,13 +949,7 @@
         </w:numPr>
       </w:pPr>
       <w:r>
-        <w:t xml:space="preserve">Référentiel des chauffeurs/opérateurs : permis (catégories, validité), habilitations, contacts. </w:t>
-      </w:r>
-      <w:r>
-        <w:rPr>
-          <w:b/>
-        </w:rPr>
-        <w:t xml:space="preserve">W</w:t>
+        <w:t xml:space="preserve">Référentiel des chauffeurs/opérateurs : permis (catégories, validité), habilitations, contacts.</w:t>
       </w:r>
     </w:p>
     <w:p>
@@ -1038,13 +961,7 @@
         </w:numPr>
       </w:pPr>
       <w:r>
-        <w:t xml:space="preserve">Création d'ordres de mission : engin, chauffeur, site d'intervention, dates, nature des travaux, génération PDF de l'ordre. </w:t>
-      </w:r>
-      <w:r>
-        <w:rPr>
-          <w:b/>
-        </w:rPr>
-        <w:t xml:space="preserve">W</w:t>
+        <w:t xml:space="preserve">Création d'ordres de mission : engin, chauffeur, site d'intervention, dates, nature des travaux, génération PDF de l'ordre.</w:t>
       </w:r>
     </w:p>
     <w:p>
@@ -1056,13 +973,7 @@
         </w:numPr>
       </w:pPr>
       <w:r>
-        <w:t xml:space="preserve">Contrôle des conflits : un engin ou un chauffeur ne peut pas être affecté à deux missions simultanées. </w:t>
-      </w:r>
-      <w:r>
-        <w:rPr>
-          <w:b/>
-        </w:rPr>
-        <w:t xml:space="preserve">W</w:t>
+        <w:t xml:space="preserve">Contrôle des conflits : un engin ou un chauffeur ne peut pas être affecté à deux missions simultanées.</w:t>
       </w:r>
     </w:p>
     <w:p>
@@ -1074,13 +985,7 @@
         </w:numPr>
       </w:pPr>
       <w:r>
-        <w:t xml:space="preserve">Côté chauffeur : réception de la mission, démarrage/clôture, relevé du compteur km et des heures de marche (avec photo du compteur), check-list de prise en main de l'engin. </w:t>
-      </w:r>
-      <w:r>
-        <w:rPr>
-          <w:b/>
-        </w:rPr>
-        <w:t xml:space="preserve">M</w:t>
+        <w:t xml:space="preserve">Espace chauffeur, optimisé pour le navigateur du téléphone : missions du jour, démarrage/clôture, relevé du compteur km et des heures de marche (avec photo du compteur), check-list de prise en main de l'engin.</w:t>
       </w:r>
     </w:p>
     <w:p>
@@ -1092,13 +997,7 @@
         </w:numPr>
       </w:pPr>
       <w:r>
-        <w:t xml:space="preserve">Signalement terrain : incident, anomalie ou panne avec photo et géolocalisation du téléphone. </w:t>
-      </w:r>
-      <w:r>
-        <w:rPr>
-          <w:b/>
-        </w:rPr>
-        <w:t xml:space="preserve">M</w:t>
+        <w:t xml:space="preserve">Signalement terrain : incident, anomalie ou panne avec photo.</w:t>
       </w:r>
     </w:p>
     <w:p>
@@ -1110,13 +1009,7 @@
         </w:numPr>
       </w:pPr>
       <w:r>
-        <w:t xml:space="preserve">Gestion des sites d'intervention (chantiers, carrières, clients) et planning visuel des missions. </w:t>
-      </w:r>
-      <w:r>
-        <w:rPr>
-          <w:b/>
-        </w:rPr>
-        <w:t xml:space="preserve">W</w:t>
+        <w:t xml:space="preserve">Gestion des sites d'intervention (chantiers, carrières, clients) et planning visuel des missions.</w:t>
       </w:r>
     </w:p>
     <w:p>
@@ -1136,13 +1029,7 @@
         </w:numPr>
       </w:pPr>
       <w:r>
-        <w:t xml:space="preserve">Plans de maintenance préventive par type d'engin, déclenchés au km, à l'heure de marche ou à la date (vidange, filtres, pneus, graissage…). </w:t>
-      </w:r>
-      <w:r>
-        <w:rPr>
-          <w:b/>
-        </w:rPr>
-        <w:t xml:space="preserve">W</w:t>
+        <w:t xml:space="preserve">Plans de maintenance préventive par type d'engin, déclenchés au km, à l'heure de marche ou à la date (vidange, filtres, pneus, graissage…).</w:t>
       </w:r>
     </w:p>
     <w:p>
@@ -1154,13 +1041,7 @@
         </w:numPr>
       </w:pPr>
       <w:r>
-        <w:t xml:space="preserve">Maintenance curative : déclaration de panne (depuis le mobile ou le web), diagnostic, ordre de travail, affectation au mécanicien, statut. </w:t>
-      </w:r>
-      <w:r>
-        <w:rPr>
-          <w:b/>
-        </w:rPr>
-        <w:t xml:space="preserve">W / M</w:t>
+        <w:t xml:space="preserve">Maintenance curative : déclaration de panne (depuis l'espace chauffeur ou le back-office), diagnostic, ordre de travail, affectation au mécanicien, statut.</w:t>
       </w:r>
     </w:p>
     <w:p>
@@ -1172,13 +1053,7 @@
         </w:numPr>
       </w:pPr>
       <w:r>
-        <w:t xml:space="preserve">Espace mécanicien : liste de ses interventions, saisie du temps passé, pièces utilisées, photos avant/après, clôture. </w:t>
-      </w:r>
-      <w:r>
-        <w:rPr>
-          <w:b/>
-        </w:rPr>
-        <w:t xml:space="preserve">M</w:t>
+        <w:t xml:space="preserve">Espace mécanicien, utilisable sur tablette ou téléphone : liste de ses interventions, saisie du temps passé, pièces utilisées, photos avant/après, clôture.</w:t>
       </w:r>
     </w:p>
     <w:p>
@@ -1190,13 +1065,7 @@
         </w:numPr>
       </w:pPr>
       <w:r>
-        <w:t xml:space="preserve">Historique complet des interventions par engin (carnet d'entretien numérique). </w:t>
-      </w:r>
-      <w:r>
-        <w:rPr>
-          <w:b/>
-        </w:rPr>
-        <w:t xml:space="preserve">W</w:t>
+        <w:t xml:space="preserve">Historique complet des interventions par engin (carnet d'entretien numérique).</w:t>
       </w:r>
     </w:p>
     <w:p>
@@ -1208,13 +1077,7 @@
         </w:numPr>
       </w:pPr>
       <w:r>
-        <w:t xml:space="preserve">Gestion des pièces de rechange : catalogue, stock par magasin, entrées/sorties, seuil d'alerte de réapprovisionnement, fournisseurs, coût unitaire. </w:t>
-      </w:r>
-      <w:r>
-        <w:rPr>
-          <w:b/>
-        </w:rPr>
-        <w:t xml:space="preserve">W</w:t>
+        <w:t xml:space="preserve">Gestion des pièces de rechange : catalogue, stock par magasin, entrées/sorties, seuil d'alerte de réapprovisionnement, fournisseurs, coût unitaire.</w:t>
       </w:r>
     </w:p>
     <w:p>
@@ -1234,13 +1097,7 @@
         </w:numPr>
       </w:pPr>
       <w:r>
-        <w:t xml:space="preserve">Saisie des pleins : engin, date, litres, prix, station ou cuve interne, compteur, photo du ticket. </w:t>
-      </w:r>
-      <w:r>
-        <w:rPr>
-          <w:b/>
-        </w:rPr>
-        <w:t xml:space="preserve">W / M</w:t>
+        <w:t xml:space="preserve">Saisie des pleins : engin, date, litres, prix, station ou cuve interne, compteur, photo du ticket.</w:t>
       </w:r>
     </w:p>
     <w:p>
@@ -1252,13 +1109,7 @@
         </w:numPr>
       </w:pPr>
       <w:r>
-        <w:t xml:space="preserve">Calcul automatique de la consommation : L/100 km pour les véhicules routiers, L/heure pour les engins de chantier. </w:t>
-      </w:r>
-      <w:r>
-        <w:rPr>
-          <w:b/>
-        </w:rPr>
-        <w:t xml:space="preserve">W</w:t>
+        <w:t xml:space="preserve">Calcul automatique de la consommation : L/100 km pour les véhicules routiers, L/heure pour les engins de chantier.</w:t>
       </w:r>
     </w:p>
     <w:p>
@@ -1270,13 +1121,7 @@
         </w:numPr>
       </w:pPr>
       <w:r>
-        <w:t xml:space="preserve">Alertes de surconsommation : écart paramétrable (ex. +15 %) par rapport à la moyenne de l'engin ou de sa catégorie. </w:t>
-      </w:r>
-      <w:r>
-        <w:rPr>
-          <w:b/>
-        </w:rPr>
-        <w:t xml:space="preserve">W / M</w:t>
+        <w:t xml:space="preserve">Alertes de surconsommation : écart paramétrable (ex. +15 %) par rapport à la moyenne de l'engin ou de sa catégorie.</w:t>
       </w:r>
     </w:p>
     <w:p>
@@ -1288,13 +1133,7 @@
         </w:numPr>
       </w:pPr>
       <w:r>
-        <w:t xml:space="preserve">Suivi des cuves internes (stock, livraisons, distributions). </w:t>
-      </w:r>
-      <w:r>
-        <w:rPr>
-          <w:b/>
-        </w:rPr>
-        <w:t xml:space="preserve">W</w:t>
+        <w:t xml:space="preserve">Suivi des cuves internes (stock, livraisons, distributions).</w:t>
       </w:r>
     </w:p>
     <w:p>
@@ -1306,13 +1145,7 @@
         </w:numPr>
       </w:pPr>
       <w:r>
-        <w:t xml:space="preserve">Coûts opérationnels par engin : carburant + maintenance + pièces + assurances/documents, ramenés au km ou à l'heure. </w:t>
-      </w:r>
-      <w:r>
-        <w:rPr>
-          <w:b/>
-        </w:rPr>
-        <w:t xml:space="preserve">W</w:t>
+        <w:t xml:space="preserve">Coûts opérationnels par engin : carburant + maintenance + pièces + assurances/documents, ramenés au km ou à l'heure.</w:t>
       </w:r>
     </w:p>
     <w:p>
@@ -1332,13 +1165,7 @@
         </w:numPr>
       </w:pPr>
       <w:r>
-        <w:t xml:space="preserve">Tableau de bord direction : taux de disponibilité du parc, taux d'utilisation, engins en panne, documents à échéance, consommation, coûts du mois. </w:t>
-      </w:r>
-      <w:r>
-        <w:rPr>
-          <w:b/>
-        </w:rPr>
-        <w:t xml:space="preserve">W</w:t>
+        <w:t xml:space="preserve">Tableau de bord direction : taux de disponibilité du parc, taux d'utilisation, engins en panne, documents à échéance, consommation, coûts du mois.</w:t>
       </w:r>
     </w:p>
     <w:p>
@@ -1350,13 +1177,7 @@
         </w:numPr>
       </w:pPr>
       <w:r>
-        <w:t xml:space="preserve">Filtres par période, site, type d'engin, chauffeur. </w:t>
-      </w:r>
-      <w:r>
-        <w:rPr>
-          <w:b/>
-        </w:rPr>
-        <w:t xml:space="preserve">W</w:t>
+        <w:t xml:space="preserve">Filtres par période, site, type d'engin, chauffeur.</w:t>
       </w:r>
     </w:p>
     <w:p>
@@ -1368,13 +1189,7 @@
         </w:numPr>
       </w:pPr>
       <w:r>
-        <w:t xml:space="preserve">Rapports types : fiche de coût par engin, rapport carburant, rapport maintenance, activité par chauffeur, rapport des missions. </w:t>
-      </w:r>
-      <w:r>
-        <w:rPr>
-          <w:b/>
-        </w:rPr>
-        <w:t xml:space="preserve">W</w:t>
+        <w:t xml:space="preserve">Rapports types : fiche de coût par engin, rapport carburant, rapport maintenance, activité par chauffeur, rapport des missions.</w:t>
       </w:r>
     </w:p>
     <w:p>
@@ -1386,13 +1201,7 @@
         </w:numPr>
       </w:pPr>
       <w:r>
-        <w:t xml:space="preserve">Export PDF et Excel de toutes les listes et rapports. </w:t>
-      </w:r>
-      <w:r>
-        <w:rPr>
-          <w:b/>
-        </w:rPr>
-        <w:t xml:space="preserve">W</w:t>
+        <w:t xml:space="preserve">Export PDF et Excel de toutes les listes et rapports.</w:t>
       </w:r>
     </w:p>
     <w:p>
@@ -1404,13 +1213,7 @@
         </w:numPr>
       </w:pPr>
       <w:r>
-        <w:t xml:space="preserve">Vue synthétique mobile pour le gestionnaire (alertes du jour, engins indisponibles). </w:t>
-      </w:r>
-      <w:r>
-        <w:rPr>
-          <w:b/>
-        </w:rPr>
-        <w:t xml:space="preserve">M</w:t>
+        <w:t xml:space="preserve">Page d'accueil adaptée à chaque rôle : alertes du jour, engins indisponibles, tâches en attente.</w:t>
       </w:r>
     </w:p>
     <w:p>
@@ -1469,7 +1272,7 @@
           <w:p>
             <w:pPr/>
             <w:r>
-              <w:t xml:space="preserve">Support</w:t>
+              <w:t xml:space="preserve">Écran habituel</w:t>
             </w:r>
           </w:p>
         </w:tc>
@@ -1504,7 +1307,7 @@
           <w:p>
             <w:pPr/>
             <w:r>
-              <w:t xml:space="preserve">Web</w:t>
+              <w:t xml:space="preserve">Ordinateur</w:t>
             </w:r>
           </w:p>
         </w:tc>
@@ -1539,7 +1342,7 @@
           <w:p>
             <w:pPr/>
             <w:r>
-              <w:t xml:space="preserve">Web + mobile</w:t>
+              <w:t xml:space="preserve">Ordinateur, tablette</w:t>
             </w:r>
           </w:p>
         </w:tc>
@@ -1574,7 +1377,7 @@
           <w:p>
             <w:pPr/>
             <w:r>
-              <w:t xml:space="preserve">Mobile + web</w:t>
+              <w:t xml:space="preserve">Tablette, smartphone</w:t>
             </w:r>
           </w:p>
         </w:tc>
@@ -1609,7 +1412,7 @@
           <w:p>
             <w:pPr/>
             <w:r>
-              <w:t xml:space="preserve">Mobile</w:t>
+              <w:t xml:space="preserve">Smartphone (navigateur)</w:t>
             </w:r>
           </w:p>
         </w:tc>
@@ -1674,7 +1477,7 @@
         <w:t xml:space="preserve">Notifications</w:t>
       </w:r>
       <w:r>
-        <w:t xml:space="preserve"> : e-mail et notifications push mobiles ; SMS en option (voir section 8).</w:t>
+        <w:t xml:space="preserve"> : e-mails et alertes dans l'application ; SMS en option (voir section 8).</w:t>
       </w:r>
     </w:p>
     <w:p>
@@ -1689,10 +1492,10 @@
         <w:rPr>
           <w:b/>
         </w:rPr>
-        <w:t xml:space="preserve">Mode hors-ligne mobile</w:t>
-      </w:r>
-      <w:r>
-        <w:t xml:space="preserve"> : saisie sans réseau sur chantier, synchronisation automatique au retour de la connexion.</w:t>
+        <w:t xml:space="preserve">Interface responsive</w:t>
+      </w:r>
+      <w:r>
+        <w:t xml:space="preserve"> : chaque écran s'adapte à l'ordinateur, à la tablette et au smartphone ; ajout possible d'un raccourci sur l'écran d'accueil du téléphone.</w:t>
       </w:r>
     </w:p>
     <w:p>
@@ -1715,6 +1518,24 @@
     </w:p>
     <w:p>
       <w:pPr>
+        <w:pStyle w:val="ListParagraph"/>
+        <w:numPr>
+          <w:ilvl w:val="0"/>
+          <w:numId w:val="9"/>
+        </w:numPr>
+      </w:pPr>
+      <w:r>
+        <w:rPr>
+          <w:b/>
+        </w:rPr>
+        <w:t xml:space="preserve">Non inclus</w:t>
+      </w:r>
+      <w:r>
+        <w:t xml:space="preserve"> : application mobile native et saisie hors connexion (disponibles en option O6).</w:t>
+      </w:r>
+    </w:p>
+    <w:p>
+      <w:pPr>
         <w:pStyle w:val="Heading2"/>
       </w:pPr>
       <w:r>
@@ -1733,7 +1554,7 @@
         <w:t xml:space="preserve">8 semaines (2 mois)</w:t>
       </w:r>
       <w:r>
-        <w:t xml:space="preserve"> avec une équipe renforcée de 7 personnes travaillant en parallèle ; la version bêta est livrée en fin de semaine 6.</w:t>
+        <w:t xml:space="preserve"> avec une équipe de 6 personnes travaillant en parallèle ; la version bêta est livrée en fin de semaine 6.</w:t>
       </w:r>
     </w:p>
     <w:p>
@@ -1880,7 +1701,7 @@
           <w:p>
             <w:pPr/>
             <w:r>
-              <w:t xml:space="preserve">Cahier des charges fonctionnel, modèle de données, maquettes web + mobile, prototype cliquable</w:t>
+              <w:t xml:space="preserve">Cahier des charges fonctionnel, modèle de données, maquettes web (écrans ordinateur et smartphone), prototype cliquable</w:t>
             </w:r>
           </w:p>
         </w:tc>
@@ -1904,7 +1725,7 @@
           <w:p>
             <w:pPr/>
             <w:r>
-              <w:t xml:space="preserve">P2 — Développement &amp; intégration API</w:t>
+              <w:t xml:space="preserve">P2 — Développement</w:t>
             </w:r>
           </w:p>
         </w:tc>
@@ -1972,7 +1793,7 @@
           <w:p>
             <w:pPr/>
             <w:r>
-              <w:t xml:space="preserve">Cahier de recette, rapport de tests, version corrigée (release candidate)</w:t>
+              <w:t xml:space="preserve">Cahier de recette, rapport de tests (dont tests sur smartphone), version corrigée</w:t>
             </w:r>
           </w:p>
         </w:tc>
@@ -2018,7 +1839,7 @@
           <w:p>
             <w:pPr/>
             <w:r>
-              <w:t xml:space="preserve">Plateforme en production, applications publiées sur les stores, 3 sessions de formation, guides utilisateur</w:t>
+              <w:t xml:space="preserve">Plateforme en production, 3 sessions de formation, guides utilisateur</w:t>
             </w:r>
           </w:p>
         </w:tc>
@@ -2044,7 +1865,7 @@
         <w:t xml:space="preserve">Équipe mobilisée</w:t>
       </w:r>
       <w:r>
-        <w:t xml:space="preserve"> : 1 chef de projet / BA, 2 développeurs backend, 1 développeur frontend web, 2 développeurs Flutter, 1 designer UI/UX (phase 1), plus un testeur QA et un DevOps ponctuellement. Ce délai suppose que le client valide les maquettes et la recette sous 3 jours ouvrés.</w:t>
+        <w:t xml:space="preserve"> : 1 chef de projet / BA, 2 développeurs backend Laravel, 2 développeurs frontend web, 1 designer UI/UX (phase 1), plus un testeur QA et un DevOps ponctuellement. Ce délai suppose que le client valide les maquettes et la recette sous 3 jours ouvrés.</w:t>
       </w:r>
     </w:p>
     <w:p>
@@ -2067,7 +1888,7 @@
         <w:t xml:space="preserve">prix forfaitaire de 550 000 FCFA HT</w:t>
       </w:r>
       <w:r>
-        <w:t xml:space="preserve"> (≈ 838 EUR HT), pour un effort estimé à 174 jours-homme. Le développement (phase 2) pèse 60 % du budget.</w:t>
+        <w:t xml:space="preserve"> (≈ 838 EUR HT), pour un effort estimé à 137 jours-homme. Le développement (phase 2) pèse près de 60 % du budget.</w:t>
       </w:r>
     </w:p>
     <w:p>
@@ -2218,7 +2039,7 @@
               <w:rPr>
                 <w:b/>
               </w:rPr>
-              <w:t xml:space="preserve">24</w:t>
+              <w:t xml:space="preserve">20</w:t>
             </w:r>
           </w:p>
         </w:tc>
@@ -2232,7 +2053,7 @@
               <w:rPr>
                 <w:b/>
               </w:rPr>
-              <w:t xml:space="preserve">76 500</w:t>
+              <w:t xml:space="preserve">80 000</w:t>
             </w:r>
           </w:p>
         </w:tc>
@@ -2289,7 +2110,7 @@
           <w:p>
             <w:pPr/>
             <w:r>
-              <w:t xml:space="preserve">30 000</w:t>
+              <w:t xml:space="preserve">32 000</w:t>
             </w:r>
           </w:p>
         </w:tc>
@@ -2313,7 +2134,7 @@
           <w:p>
             <w:pPr/>
             <w:r>
-              <w:t xml:space="preserve">Architecture technique, modèle de données, spécifications API</w:t>
+              <w:t xml:space="preserve">Architecture technique, modèle de données</w:t>
             </w:r>
           </w:p>
         </w:tc>
@@ -2346,7 +2167,7 @@
           <w:p>
             <w:pPr/>
             <w:r>
-              <w:t xml:space="preserve">13 000</w:t>
+              <w:t xml:space="preserve">16 000</w:t>
             </w:r>
           </w:p>
         </w:tc>
@@ -2370,7 +2191,7 @@
           <w:p>
             <w:pPr/>
             <w:r>
-              <w:t xml:space="preserve">Maquettes et prototype cliquable web + mobile (Figma), charte UI</w:t>
+              <w:t xml:space="preserve">Maquettes et prototype cliquable web, ordinateur + smartphone (Figma), charte UI</w:t>
             </w:r>
           </w:p>
         </w:tc>
@@ -2392,18 +2213,18 @@
           <w:p>
             <w:pPr/>
             <w:r>
-              <w:t xml:space="preserve">12</w:t>
-            </w:r>
-          </w:p>
-        </w:tc>
-        <w:tc>
-          <w:tcPr>
-            <w:tcW w:w="1872" w:type="dxa"/>
-          </w:tcPr>
-          <w:p>
-            <w:pPr/>
-            <w:r>
-              <w:t xml:space="preserve">33 500</w:t>
+              <w:t xml:space="preserve">8</w:t>
+            </w:r>
+          </w:p>
+        </w:tc>
+        <w:tc>
+          <w:tcPr>
+            <w:tcW w:w="1872" w:type="dxa"/>
+          </w:tcPr>
+          <w:p>
+            <w:pPr/>
+            <w:r>
+              <w:t xml:space="preserve">32 000</w:t>
             </w:r>
           </w:p>
         </w:tc>
@@ -2433,7 +2254,7 @@
               <w:rPr>
                 <w:b/>
               </w:rPr>
-              <w:t xml:space="preserve">Développement backend / frontend / mobile &amp; intégration API</w:t>
+              <w:t xml:space="preserve">Développement backend &amp; frontend web</w:t>
             </w:r>
           </w:p>
         </w:tc>
@@ -2455,7 +2276,7 @@
               <w:rPr>
                 <w:b/>
               </w:rPr>
-              <w:t xml:space="preserve">105</w:t>
+              <w:t xml:space="preserve">80</w:t>
             </w:r>
           </w:p>
         </w:tc>
@@ -2469,7 +2290,7 @@
               <w:rPr>
                 <w:b/>
               </w:rPr>
-              <w:t xml:space="preserve">329 500</w:t>
+              <w:t xml:space="preserve">322 000</w:t>
             </w:r>
           </w:p>
         </w:tc>
@@ -2493,7 +2314,7 @@
           <w:p>
             <w:pPr/>
             <w:r>
-              <w:t xml:space="preserve">Socle technique : authentification, API REST, environnements, CI/CD</w:t>
+              <w:t xml:space="preserve">Socle technique : authentification, environnements, CI/CD</w:t>
             </w:r>
           </w:p>
         </w:tc>
@@ -2515,18 +2336,18 @@
           <w:p>
             <w:pPr/>
             <w:r>
-              <w:t xml:space="preserve">6</w:t>
-            </w:r>
-          </w:p>
-        </w:tc>
-        <w:tc>
-          <w:tcPr>
-            <w:tcW w:w="1872" w:type="dxa"/>
-          </w:tcPr>
-          <w:p>
-            <w:pPr/>
-            <w:r>
-              <w:t xml:space="preserve">19 500</w:t>
+              <w:t xml:space="preserve">5</w:t>
+            </w:r>
+          </w:p>
+        </w:tc>
+        <w:tc>
+          <w:tcPr>
+            <w:tcW w:w="1872" w:type="dxa"/>
+          </w:tcPr>
+          <w:p>
+            <w:pPr/>
+            <w:r>
+              <w:t xml:space="preserve">20 000</w:t>
             </w:r>
           </w:p>
         </w:tc>
@@ -2550,40 +2371,40 @@
           <w:p>
             <w:pPr/>
             <w:r>
-              <w:t xml:space="preserve">Module 1 — Parc d'engins (6 j back, 5 j web, 2 j mobile)</w:t>
-            </w:r>
-          </w:p>
-        </w:tc>
-        <w:tc>
-          <w:tcPr>
-            <w:tcW w:w="1872" w:type="dxa"/>
-          </w:tcPr>
-          <w:p>
-            <w:pPr/>
-            <w:r>
-              <w:t xml:space="preserve">Back/Web/Mobile</w:t>
-            </w:r>
-          </w:p>
-        </w:tc>
-        <w:tc>
-          <w:tcPr>
-            <w:tcW w:w="1872" w:type="dxa"/>
-          </w:tcPr>
-          <w:p>
-            <w:pPr/>
-            <w:r>
-              <w:t xml:space="preserve">13</w:t>
-            </w:r>
-          </w:p>
-        </w:tc>
-        <w:tc>
-          <w:tcPr>
-            <w:tcW w:w="1872" w:type="dxa"/>
-          </w:tcPr>
-          <w:p>
-            <w:pPr/>
-            <w:r>
-              <w:t xml:space="preserve">40 500</w:t>
+              <w:t xml:space="preserve">Module 1 — Parc d'engins (6 j back, 5 j front)</w:t>
+            </w:r>
+          </w:p>
+        </w:tc>
+        <w:tc>
+          <w:tcPr>
+            <w:tcW w:w="1872" w:type="dxa"/>
+          </w:tcPr>
+          <w:p>
+            <w:pPr/>
+            <w:r>
+              <w:t xml:space="preserve">Back/Front</w:t>
+            </w:r>
+          </w:p>
+        </w:tc>
+        <w:tc>
+          <w:tcPr>
+            <w:tcW w:w="1872" w:type="dxa"/>
+          </w:tcPr>
+          <w:p>
+            <w:pPr/>
+            <w:r>
+              <w:t xml:space="preserve">11</w:t>
+            </w:r>
+          </w:p>
+        </w:tc>
+        <w:tc>
+          <w:tcPr>
+            <w:tcW w:w="1872" w:type="dxa"/>
+          </w:tcPr>
+          <w:p>
+            <w:pPr/>
+            <w:r>
+              <w:t xml:space="preserve">44 000</w:t>
             </w:r>
           </w:p>
         </w:tc>
@@ -2607,40 +2428,40 @@
           <w:p>
             <w:pPr/>
             <w:r>
-              <w:t xml:space="preserve">Module 2 — Activités &amp; missions (8 j back, 6 j web, 8 j mobile)</w:t>
-            </w:r>
-          </w:p>
-        </w:tc>
-        <w:tc>
-          <w:tcPr>
-            <w:tcW w:w="1872" w:type="dxa"/>
-          </w:tcPr>
-          <w:p>
-            <w:pPr/>
-            <w:r>
-              <w:t xml:space="preserve">Back/Web/Mobile</w:t>
-            </w:r>
-          </w:p>
-        </w:tc>
-        <w:tc>
-          <w:tcPr>
-            <w:tcW w:w="1872" w:type="dxa"/>
-          </w:tcPr>
-          <w:p>
-            <w:pPr/>
-            <w:r>
-              <w:t xml:space="preserve">22</w:t>
-            </w:r>
-          </w:p>
-        </w:tc>
-        <w:tc>
-          <w:tcPr>
-            <w:tcW w:w="1872" w:type="dxa"/>
-          </w:tcPr>
-          <w:p>
-            <w:pPr/>
-            <w:r>
-              <w:t xml:space="preserve">69 000</w:t>
+              <w:t xml:space="preserve">Module 2 — Activités &amp; missions (8 j back, 6 j front)</w:t>
+            </w:r>
+          </w:p>
+        </w:tc>
+        <w:tc>
+          <w:tcPr>
+            <w:tcW w:w="1872" w:type="dxa"/>
+          </w:tcPr>
+          <w:p>
+            <w:pPr/>
+            <w:r>
+              <w:t xml:space="preserve">Back/Front</w:t>
+            </w:r>
+          </w:p>
+        </w:tc>
+        <w:tc>
+          <w:tcPr>
+            <w:tcW w:w="1872" w:type="dxa"/>
+          </w:tcPr>
+          <w:p>
+            <w:pPr/>
+            <w:r>
+              <w:t xml:space="preserve">14</w:t>
+            </w:r>
+          </w:p>
+        </w:tc>
+        <w:tc>
+          <w:tcPr>
+            <w:tcW w:w="1872" w:type="dxa"/>
+          </w:tcPr>
+          <w:p>
+            <w:pPr/>
+            <w:r>
+              <w:t xml:space="preserve">57 000</w:t>
             </w:r>
           </w:p>
         </w:tc>
@@ -2664,40 +2485,40 @@
           <w:p>
             <w:pPr/>
             <w:r>
-              <w:t xml:space="preserve">Module 3 — Maintenance &amp; pièces (8 j back, 7 j web, 3 j mobile)</w:t>
-            </w:r>
-          </w:p>
-        </w:tc>
-        <w:tc>
-          <w:tcPr>
-            <w:tcW w:w="1872" w:type="dxa"/>
-          </w:tcPr>
-          <w:p>
-            <w:pPr/>
-            <w:r>
-              <w:t xml:space="preserve">Back/Web/Mobile</w:t>
-            </w:r>
-          </w:p>
-        </w:tc>
-        <w:tc>
-          <w:tcPr>
-            <w:tcW w:w="1872" w:type="dxa"/>
-          </w:tcPr>
-          <w:p>
-            <w:pPr/>
-            <w:r>
-              <w:t xml:space="preserve">18</w:t>
-            </w:r>
-          </w:p>
-        </w:tc>
-        <w:tc>
-          <w:tcPr>
-            <w:tcW w:w="1872" w:type="dxa"/>
-          </w:tcPr>
-          <w:p>
-            <w:pPr/>
-            <w:r>
-              <w:t xml:space="preserve">56 000</w:t>
+              <w:t xml:space="preserve">Module 3 — Maintenance &amp; pièces (8 j back, 7 j front)</w:t>
+            </w:r>
+          </w:p>
+        </w:tc>
+        <w:tc>
+          <w:tcPr>
+            <w:tcW w:w="1872" w:type="dxa"/>
+          </w:tcPr>
+          <w:p>
+            <w:pPr/>
+            <w:r>
+              <w:t xml:space="preserve">Back/Front</w:t>
+            </w:r>
+          </w:p>
+        </w:tc>
+        <w:tc>
+          <w:tcPr>
+            <w:tcW w:w="1872" w:type="dxa"/>
+          </w:tcPr>
+          <w:p>
+            <w:pPr/>
+            <w:r>
+              <w:t xml:space="preserve">15</w:t>
+            </w:r>
+          </w:p>
+        </w:tc>
+        <w:tc>
+          <w:tcPr>
+            <w:tcW w:w="1872" w:type="dxa"/>
+          </w:tcPr>
+          <w:p>
+            <w:pPr/>
+            <w:r>
+              <w:t xml:space="preserve">61 000</w:t>
             </w:r>
           </w:p>
         </w:tc>
@@ -2721,40 +2542,40 @@
           <w:p>
             <w:pPr/>
             <w:r>
-              <w:t xml:space="preserve">Module 4 — Carburant &amp; coûts (6 j back, 4 j web, 4 j mobile)</w:t>
-            </w:r>
-          </w:p>
-        </w:tc>
-        <w:tc>
-          <w:tcPr>
-            <w:tcW w:w="1872" w:type="dxa"/>
-          </w:tcPr>
-          <w:p>
-            <w:pPr/>
-            <w:r>
-              <w:t xml:space="preserve">Back/Web/Mobile</w:t>
-            </w:r>
-          </w:p>
-        </w:tc>
-        <w:tc>
-          <w:tcPr>
-            <w:tcW w:w="1872" w:type="dxa"/>
-          </w:tcPr>
-          <w:p>
-            <w:pPr/>
-            <w:r>
-              <w:t xml:space="preserve">14</w:t>
-            </w:r>
-          </w:p>
-        </w:tc>
-        <w:tc>
-          <w:tcPr>
-            <w:tcW w:w="1872" w:type="dxa"/>
-          </w:tcPr>
-          <w:p>
-            <w:pPr/>
-            <w:r>
-              <w:t xml:space="preserve">44 000</w:t>
+              <w:t xml:space="preserve">Module 4 — Carburant &amp; coûts (6 j back, 4 j front)</w:t>
+            </w:r>
+          </w:p>
+        </w:tc>
+        <w:tc>
+          <w:tcPr>
+            <w:tcW w:w="1872" w:type="dxa"/>
+          </w:tcPr>
+          <w:p>
+            <w:pPr/>
+            <w:r>
+              <w:t xml:space="preserve">Back/Front</w:t>
+            </w:r>
+          </w:p>
+        </w:tc>
+        <w:tc>
+          <w:tcPr>
+            <w:tcW w:w="1872" w:type="dxa"/>
+          </w:tcPr>
+          <w:p>
+            <w:pPr/>
+            <w:r>
+              <w:t xml:space="preserve">10</w:t>
+            </w:r>
+          </w:p>
+        </w:tc>
+        <w:tc>
+          <w:tcPr>
+            <w:tcW w:w="1872" w:type="dxa"/>
+          </w:tcPr>
+          <w:p>
+            <w:pPr/>
+            <w:r>
+              <w:t xml:space="preserve">40 000</w:t>
             </w:r>
           </w:p>
         </w:tc>
@@ -2778,40 +2599,40 @@
           <w:p>
             <w:pPr/>
             <w:r>
-              <w:t xml:space="preserve">Module 5 — Tableaux de bord &amp; exports PDF/Excel (5 j back, 7 j web, 1 j mobile)</w:t>
-            </w:r>
-          </w:p>
-        </w:tc>
-        <w:tc>
-          <w:tcPr>
-            <w:tcW w:w="1872" w:type="dxa"/>
-          </w:tcPr>
-          <w:p>
-            <w:pPr/>
-            <w:r>
-              <w:t xml:space="preserve">Back/Web/Mobile</w:t>
-            </w:r>
-          </w:p>
-        </w:tc>
-        <w:tc>
-          <w:tcPr>
-            <w:tcW w:w="1872" w:type="dxa"/>
-          </w:tcPr>
-          <w:p>
-            <w:pPr/>
-            <w:r>
-              <w:t xml:space="preserve">13</w:t>
-            </w:r>
-          </w:p>
-        </w:tc>
-        <w:tc>
-          <w:tcPr>
-            <w:tcW w:w="1872" w:type="dxa"/>
-          </w:tcPr>
-          <w:p>
-            <w:pPr/>
-            <w:r>
-              <w:t xml:space="preserve">39 500</w:t>
+              <w:t xml:space="preserve">Module 5 — Tableaux de bord &amp; exports PDF/Excel (5 j back, 7 j front)</w:t>
+            </w:r>
+          </w:p>
+        </w:tc>
+        <w:tc>
+          <w:tcPr>
+            <w:tcW w:w="1872" w:type="dxa"/>
+          </w:tcPr>
+          <w:p>
+            <w:pPr/>
+            <w:r>
+              <w:t xml:space="preserve">Back/Front</w:t>
+            </w:r>
+          </w:p>
+        </w:tc>
+        <w:tc>
+          <w:tcPr>
+            <w:tcW w:w="1872" w:type="dxa"/>
+          </w:tcPr>
+          <w:p>
+            <w:pPr/>
+            <w:r>
+              <w:t xml:space="preserve">12</w:t>
+            </w:r>
+          </w:p>
+        </w:tc>
+        <w:tc>
+          <w:tcPr>
+            <w:tcW w:w="1872" w:type="dxa"/>
+          </w:tcPr>
+          <w:p>
+            <w:pPr/>
+            <w:r>
+              <w:t xml:space="preserve">48 000</w:t>
             </w:r>
           </w:p>
         </w:tc>
@@ -2835,40 +2656,40 @@
           <w:p>
             <w:pPr/>
             <w:r>
-              <w:t xml:space="preserve">Module 6 — Utilisateurs, rôles, audit (4 j back, 3 j web, 1 j mobile)</w:t>
-            </w:r>
-          </w:p>
-        </w:tc>
-        <w:tc>
-          <w:tcPr>
-            <w:tcW w:w="1872" w:type="dxa"/>
-          </w:tcPr>
-          <w:p>
-            <w:pPr/>
-            <w:r>
-              <w:t xml:space="preserve">Back/Web/Mobile</w:t>
-            </w:r>
-          </w:p>
-        </w:tc>
-        <w:tc>
-          <w:tcPr>
-            <w:tcW w:w="1872" w:type="dxa"/>
-          </w:tcPr>
-          <w:p>
-            <w:pPr/>
-            <w:r>
-              <w:t xml:space="preserve">8</w:t>
-            </w:r>
-          </w:p>
-        </w:tc>
-        <w:tc>
-          <w:tcPr>
-            <w:tcW w:w="1872" w:type="dxa"/>
-          </w:tcPr>
-          <w:p>
-            <w:pPr/>
-            <w:r>
-              <w:t xml:space="preserve">25 000</w:t>
+              <w:t xml:space="preserve">Module 6 — Utilisateurs, rôles, audit (4 j back, 3 j front)</w:t>
+            </w:r>
+          </w:p>
+        </w:tc>
+        <w:tc>
+          <w:tcPr>
+            <w:tcW w:w="1872" w:type="dxa"/>
+          </w:tcPr>
+          <w:p>
+            <w:pPr/>
+            <w:r>
+              <w:t xml:space="preserve">Back/Front</w:t>
+            </w:r>
+          </w:p>
+        </w:tc>
+        <w:tc>
+          <w:tcPr>
+            <w:tcW w:w="1872" w:type="dxa"/>
+          </w:tcPr>
+          <w:p>
+            <w:pPr/>
+            <w:r>
+              <w:t xml:space="preserve">7</w:t>
+            </w:r>
+          </w:p>
+        </w:tc>
+        <w:tc>
+          <w:tcPr>
+            <w:tcW w:w="1872" w:type="dxa"/>
+          </w:tcPr>
+          <w:p>
+            <w:pPr/>
+            <w:r>
+              <w:t xml:space="preserve">28 000</w:t>
             </w:r>
           </w:p>
         </w:tc>
@@ -2892,40 +2713,40 @@
           <w:p>
             <w:pPr/>
             <w:r>
-              <w:t xml:space="preserve">Notifications e-mail + push (3 j back, 2 j mobile)</w:t>
-            </w:r>
-          </w:p>
-        </w:tc>
-        <w:tc>
-          <w:tcPr>
-            <w:tcW w:w="1872" w:type="dxa"/>
-          </w:tcPr>
-          <w:p>
-            <w:pPr/>
-            <w:r>
-              <w:t xml:space="preserve">Back/Mobile</w:t>
-            </w:r>
-          </w:p>
-        </w:tc>
-        <w:tc>
-          <w:tcPr>
-            <w:tcW w:w="1872" w:type="dxa"/>
-          </w:tcPr>
-          <w:p>
-            <w:pPr/>
-            <w:r>
-              <w:t xml:space="preserve">5</w:t>
-            </w:r>
-          </w:p>
-        </w:tc>
-        <w:tc>
-          <w:tcPr>
-            <w:tcW w:w="1872" w:type="dxa"/>
-          </w:tcPr>
-          <w:p>
-            <w:pPr/>
-            <w:r>
-              <w:t xml:space="preserve">16 500</w:t>
+              <w:t xml:space="preserve">Notifications e-mail et alertes dans l'application</w:t>
+            </w:r>
+          </w:p>
+        </w:tc>
+        <w:tc>
+          <w:tcPr>
+            <w:tcW w:w="1872" w:type="dxa"/>
+          </w:tcPr>
+          <w:p>
+            <w:pPr/>
+            <w:r>
+              <w:t xml:space="preserve">Backend</w:t>
+            </w:r>
+          </w:p>
+        </w:tc>
+        <w:tc>
+          <w:tcPr>
+            <w:tcW w:w="1872" w:type="dxa"/>
+          </w:tcPr>
+          <w:p>
+            <w:pPr/>
+            <w:r>
+              <w:t xml:space="preserve">2</w:t>
+            </w:r>
+          </w:p>
+        </w:tc>
+        <w:tc>
+          <w:tcPr>
+            <w:tcW w:w="1872" w:type="dxa"/>
+          </w:tcPr>
+          <w:p>
+            <w:pPr/>
+            <w:r>
+              <w:t xml:space="preserve">8 000</w:t>
             </w:r>
           </w:p>
         </w:tc>
@@ -2949,40 +2770,40 @@
           <w:p>
             <w:pPr/>
             <w:r>
-              <w:t xml:space="preserve">Mode hors-ligne &amp; synchronisation mobile</w:t>
-            </w:r>
-          </w:p>
-        </w:tc>
-        <w:tc>
-          <w:tcPr>
-            <w:tcW w:w="1872" w:type="dxa"/>
-          </w:tcPr>
-          <w:p>
-            <w:pPr/>
-            <w:r>
-              <w:t xml:space="preserve">Mobile</w:t>
-            </w:r>
-          </w:p>
-        </w:tc>
-        <w:tc>
-          <w:tcPr>
-            <w:tcW w:w="1872" w:type="dxa"/>
-          </w:tcPr>
-          <w:p>
-            <w:pPr/>
-            <w:r>
-              <w:t xml:space="preserve">6</w:t>
-            </w:r>
-          </w:p>
-        </w:tc>
-        <w:tc>
-          <w:tcPr>
-            <w:tcW w:w="1872" w:type="dxa"/>
-          </w:tcPr>
-          <w:p>
-            <w:pPr/>
-            <w:r>
-              <w:t xml:space="preserve">19 500</w:t>
+              <w:t xml:space="preserve">Adaptation smartphone des espaces chauffeur et mécanicien (photos, saisie rapide)</w:t>
+            </w:r>
+          </w:p>
+        </w:tc>
+        <w:tc>
+          <w:tcPr>
+            <w:tcW w:w="1872" w:type="dxa"/>
+          </w:tcPr>
+          <w:p>
+            <w:pPr/>
+            <w:r>
+              <w:t xml:space="preserve">Frontend</w:t>
+            </w:r>
+          </w:p>
+        </w:tc>
+        <w:tc>
+          <w:tcPr>
+            <w:tcW w:w="1872" w:type="dxa"/>
+          </w:tcPr>
+          <w:p>
+            <w:pPr/>
+            <w:r>
+              <w:t xml:space="preserve">4</w:t>
+            </w:r>
+          </w:p>
+        </w:tc>
+        <w:tc>
+          <w:tcPr>
+            <w:tcW w:w="1872" w:type="dxa"/>
+          </w:tcPr>
+          <w:p>
+            <w:pPr/>
+            <w:r>
+              <w:t xml:space="preserve">16 000</w:t>
             </w:r>
           </w:p>
         </w:tc>
@@ -3034,7 +2855,7 @@
               <w:rPr>
                 <w:b/>
               </w:rPr>
-              <w:t xml:space="preserve">21</w:t>
+              <w:t xml:space="preserve">17</w:t>
             </w:r>
           </w:p>
         </w:tc>
@@ -3048,7 +2869,7 @@
               <w:rPr>
                 <w:b/>
               </w:rPr>
-              <w:t xml:space="preserve">59 000</w:t>
+              <w:t xml:space="preserve">68 000</w:t>
             </w:r>
           </w:p>
         </w:tc>
@@ -3072,7 +2893,7 @@
           <w:p>
             <w:pPr/>
             <w:r>
-              <w:t xml:space="preserve">Plan de tests, tests fonctionnels et de non-régression</w:t>
+              <w:t xml:space="preserve">Plan de tests, tests fonctionnels, non-régression, tests sur navigateurs et smartphones</w:t>
             </w:r>
           </w:p>
         </w:tc>
@@ -3094,18 +2915,18 @@
           <w:p>
             <w:pPr/>
             <w:r>
-              <w:t xml:space="preserve">10</w:t>
-            </w:r>
-          </w:p>
-        </w:tc>
-        <w:tc>
-          <w:tcPr>
-            <w:tcW w:w="1872" w:type="dxa"/>
-          </w:tcPr>
-          <w:p>
-            <w:pPr/>
-            <w:r>
-              <w:t xml:space="preserve">22 500</w:t>
+              <w:t xml:space="preserve">8</w:t>
+            </w:r>
+          </w:p>
+        </w:tc>
+        <w:tc>
+          <w:tcPr>
+            <w:tcW w:w="1872" w:type="dxa"/>
+          </w:tcPr>
+          <w:p>
+            <w:pPr/>
+            <w:r>
+              <w:t xml:space="preserve">32 000</w:t>
             </w:r>
           </w:p>
         </w:tc>
@@ -3162,7 +2983,7 @@
           <w:p>
             <w:pPr/>
             <w:r>
-              <w:t xml:space="preserve">10 000</w:t>
+              <w:t xml:space="preserve">12 000</w:t>
             </w:r>
           </w:p>
         </w:tc>
@@ -3197,29 +3018,29 @@
           <w:p>
             <w:pPr/>
             <w:r>
-              <w:t xml:space="preserve">Backend/Mobile</w:t>
-            </w:r>
-          </w:p>
-        </w:tc>
-        <w:tc>
-          <w:tcPr>
-            <w:tcW w:w="1872" w:type="dxa"/>
-          </w:tcPr>
-          <w:p>
-            <w:pPr/>
-            <w:r>
-              <w:t xml:space="preserve">8</w:t>
-            </w:r>
-          </w:p>
-        </w:tc>
-        <w:tc>
-          <w:tcPr>
-            <w:tcW w:w="1872" w:type="dxa"/>
-          </w:tcPr>
-          <w:p>
-            <w:pPr/>
-            <w:r>
-              <w:t xml:space="preserve">26 500</w:t>
+              <w:t xml:space="preserve">Back/Front</w:t>
+            </w:r>
+          </w:p>
+        </w:tc>
+        <w:tc>
+          <w:tcPr>
+            <w:tcW w:w="1872" w:type="dxa"/>
+          </w:tcPr>
+          <w:p>
+            <w:pPr/>
+            <w:r>
+              <w:t xml:space="preserve">6</w:t>
+            </w:r>
+          </w:p>
+        </w:tc>
+        <w:tc>
+          <w:tcPr>
+            <w:tcW w:w="1872" w:type="dxa"/>
+          </w:tcPr>
+          <w:p>
+            <w:pPr/>
+            <w:r>
+              <w:t xml:space="preserve">24 000</w:t>
             </w:r>
           </w:p>
         </w:tc>
@@ -3271,7 +3092,7 @@
               <w:rPr>
                 <w:b/>
               </w:rPr>
-              <w:t xml:space="preserve">12</w:t>
+              <w:t xml:space="preserve">10</w:t>
             </w:r>
           </w:p>
         </w:tc>
@@ -3342,7 +3163,7 @@
           <w:p>
             <w:pPr/>
             <w:r>
-              <w:t xml:space="preserve">10 000</w:t>
+              <w:t xml:space="preserve">12 000</w:t>
             </w:r>
           </w:p>
         </w:tc>
@@ -3366,40 +3187,40 @@
           <w:p>
             <w:pPr/>
             <w:r>
-              <w:t xml:space="preserve">Publication Google Play Store et Apple App Store</w:t>
-            </w:r>
-          </w:p>
-        </w:tc>
-        <w:tc>
-          <w:tcPr>
-            <w:tcW w:w="1872" w:type="dxa"/>
-          </w:tcPr>
-          <w:p>
-            <w:pPr/>
-            <w:r>
-              <w:t xml:space="preserve">Mobile</w:t>
-            </w:r>
-          </w:p>
-        </w:tc>
-        <w:tc>
-          <w:tcPr>
-            <w:tcW w:w="1872" w:type="dxa"/>
-          </w:tcPr>
-          <w:p>
-            <w:pPr/>
-            <w:r>
-              <w:t xml:space="preserve">2</w:t>
-            </w:r>
-          </w:p>
-        </w:tc>
-        <w:tc>
-          <w:tcPr>
-            <w:tcW w:w="1872" w:type="dxa"/>
-          </w:tcPr>
-          <w:p>
-            <w:pPr/>
-            <w:r>
-              <w:t xml:space="preserve">6 500</w:t>
+              <w:t xml:space="preserve">Formation : 3 sessions (admins, gestionnaires, chauffeurs/mécaniciens)</w:t>
+            </w:r>
+          </w:p>
+        </w:tc>
+        <w:tc>
+          <w:tcPr>
+            <w:tcW w:w="1872" w:type="dxa"/>
+          </w:tcPr>
+          <w:p>
+            <w:pPr/>
+            <w:r>
+              <w:t xml:space="preserve">CP/BA</w:t>
+            </w:r>
+          </w:p>
+        </w:tc>
+        <w:tc>
+          <w:tcPr>
+            <w:tcW w:w="1872" w:type="dxa"/>
+          </w:tcPr>
+          <w:p>
+            <w:pPr/>
+            <w:r>
+              <w:t xml:space="preserve">4</w:t>
+            </w:r>
+          </w:p>
+        </w:tc>
+        <w:tc>
+          <w:tcPr>
+            <w:tcW w:w="1872" w:type="dxa"/>
+          </w:tcPr>
+          <w:p>
+            <w:pPr/>
+            <w:r>
+              <w:t xml:space="preserve">16 000</w:t>
             </w:r>
           </w:p>
         </w:tc>
@@ -3423,63 +3244,6 @@
           <w:p>
             <w:pPr/>
             <w:r>
-              <w:t xml:space="preserve">Formation : 3 sessions (admins, gestionnaires, chauffeurs/mécaniciens)</w:t>
-            </w:r>
-          </w:p>
-        </w:tc>
-        <w:tc>
-          <w:tcPr>
-            <w:tcW w:w="1872" w:type="dxa"/>
-          </w:tcPr>
-          <w:p>
-            <w:pPr/>
-            <w:r>
-              <w:t xml:space="preserve">CP/BA</w:t>
-            </w:r>
-          </w:p>
-        </w:tc>
-        <w:tc>
-          <w:tcPr>
-            <w:tcW w:w="1872" w:type="dxa"/>
-          </w:tcPr>
-          <w:p>
-            <w:pPr/>
-            <w:r>
-              <w:t xml:space="preserve">4</w:t>
-            </w:r>
-          </w:p>
-        </w:tc>
-        <w:tc>
-          <w:tcPr>
-            <w:tcW w:w="1872" w:type="dxa"/>
-          </w:tcPr>
-          <w:p>
-            <w:pPr/>
-            <w:r>
-              <w:t xml:space="preserve">15 000</w:t>
-            </w:r>
-          </w:p>
-        </w:tc>
-      </w:tr>
-      <w:tr>
-        <w:tc>
-          <w:tcPr>
-            <w:tcW w:w="1872" w:type="dxa"/>
-          </w:tcPr>
-          <w:p>
-            <w:pPr/>
-            <w:r>
-              <w:t xml:space="preserve">4.4</w:t>
-            </w:r>
-          </w:p>
-        </w:tc>
-        <w:tc>
-          <w:tcPr>
-            <w:tcW w:w="1872" w:type="dxa"/>
-          </w:tcPr>
-          <w:p>
-            <w:pPr/>
-            <w:r>
               <w:t xml:space="preserve">Guide utilisateur, fiches réflexes, documentation technique</w:t>
             </w:r>
           </w:p>
@@ -3513,7 +3277,7 @@
           <w:p>
             <w:pPr/>
             <w:r>
-              <w:t xml:space="preserve">8 500</w:t>
+              <w:t xml:space="preserve">12 000</w:t>
             </w:r>
           </w:p>
         </w:tc>
@@ -3571,7 +3335,7 @@
               <w:rPr>
                 <w:b/>
               </w:rPr>
-              <w:t xml:space="preserve">12</w:t>
+              <w:t xml:space="preserve">10</w:t>
             </w:r>
           </w:p>
         </w:tc>
@@ -3585,7 +3349,7 @@
               <w:rPr>
                 <w:b/>
               </w:rPr>
-              <w:t xml:space="preserve">45 000</w:t>
+              <w:t xml:space="preserve">40 000</w:t>
             </w:r>
           </w:p>
         </w:tc>
@@ -3658,7 +3422,7 @@
           <w:p>
             <w:pPr/>
             <w:r>
-              <w:t xml:space="preserve">76 500</w:t>
+              <w:t xml:space="preserve">80 000</w:t>
             </w:r>
           </w:p>
         </w:tc>
@@ -3682,7 +3446,7 @@
           <w:p>
             <w:pPr/>
             <w:r>
-              <w:t xml:space="preserve">329 500</w:t>
+              <w:t xml:space="preserve">322 000</w:t>
             </w:r>
           </w:p>
         </w:tc>
@@ -3706,7 +3470,7 @@
           <w:p>
             <w:pPr/>
             <w:r>
-              <w:t xml:space="preserve">59 000</w:t>
+              <w:t xml:space="preserve">68 000</w:t>
             </w:r>
           </w:p>
         </w:tc>
@@ -3754,7 +3518,7 @@
           <w:p>
             <w:pPr/>
             <w:r>
-              <w:t xml:space="preserve">45 000</w:t>
+              <w:t xml:space="preserve">40 000</w:t>
             </w:r>
           </w:p>
         </w:tc>
@@ -4492,7 +4256,7 @@
         <w:t xml:space="preserve">6 500 FCFA HT/mois</w:t>
       </w:r>
       <w:r>
-        <w:t xml:space="preserve"> (engagement 12 mois) comprenant correctifs, mises à jour de sécurité, sauvegardes supervisées, compatibilité nouvelles versions Android/iOS et 2 jours d'évolutions mineures par mois.</w:t>
+        <w:t xml:space="preserve"> (engagement 12 mois) comprenant correctifs, mises à jour de sécurité, sauvegardes supervisées, compatibilité avec les nouvelles versions des navigateurs et 2 jours d'évolutions mineures par mois.</w:t>
       </w:r>
     </w:p>
     <w:p>
@@ -4911,6 +4675,52 @@
           </w:p>
         </w:tc>
       </w:tr>
+      <w:tr>
+        <w:tc>
+          <w:tcPr>
+            <w:tcW w:w="2340" w:type="dxa"/>
+          </w:tcPr>
+          <w:p>
+            <w:pPr/>
+            <w:r>
+              <w:t xml:space="preserve">O6 — Application mobile Flutter</w:t>
+            </w:r>
+          </w:p>
+        </w:tc>
+        <w:tc>
+          <w:tcPr>
+            <w:tcW w:w="2340" w:type="dxa"/>
+          </w:tcPr>
+          <w:p>
+            <w:pPr/>
+            <w:r>
+              <w:t xml:space="preserve">Application Android/iOS pour chauffeurs et mécaniciens, saisie hors connexion, notifications push, publication sur les stores</w:t>
+            </w:r>
+          </w:p>
+        </w:tc>
+        <w:tc>
+          <w:tcPr>
+            <w:tcW w:w="2340" w:type="dxa"/>
+          </w:tcPr>
+          <w:p>
+            <w:pPr/>
+            <w:r>
+              <w:t xml:space="preserve">33</w:t>
+            </w:r>
+          </w:p>
+        </w:tc>
+        <w:tc>
+          <w:tcPr>
+            <w:tcW w:w="2340" w:type="dxa"/>
+          </w:tcPr>
+          <w:p>
+            <w:pPr/>
+            <w:r>
+              <w:t xml:space="preserve">132 500</w:t>
+            </w:r>
+          </w:p>
+        </w:tc>
+      </w:tr>
     </w:tbl>
     <w:p>
       <w:pPr>
@@ -5004,54 +4814,6 @@
             <w:pPr/>
             <w:r>
               <w:t xml:space="preserve">10 000 à 20 000 FCFA / an (SSL gratuit via Let's Encrypt)</w:t>
-            </w:r>
-          </w:p>
-        </w:tc>
-      </w:tr>
-      <w:tr>
-        <w:tc>
-          <w:tcPr>
-            <w:tcW w:w="4680" w:type="dxa"/>
-          </w:tcPr>
-          <w:p>
-            <w:pPr/>
-            <w:r>
-              <w:t xml:space="preserve">Compte développeur Apple</w:t>
-            </w:r>
-          </w:p>
-        </w:tc>
-        <w:tc>
-          <w:tcPr>
-            <w:tcW w:w="4680" w:type="dxa"/>
-          </w:tcPr>
-          <w:p>
-            <w:pPr/>
-            <w:r>
-              <w:t xml:space="preserve">99 USD / an</w:t>
-            </w:r>
-          </w:p>
-        </w:tc>
-      </w:tr>
-      <w:tr>
-        <w:tc>
-          <w:tcPr>
-            <w:tcW w:w="4680" w:type="dxa"/>
-          </w:tcPr>
-          <w:p>
-            <w:pPr/>
-            <w:r>
-              <w:t xml:space="preserve">Compte développeur Google Play</w:t>
-            </w:r>
-          </w:p>
-        </w:tc>
-        <w:tc>
-          <w:tcPr>
-            <w:tcW w:w="4680" w:type="dxa"/>
-          </w:tcPr>
-          <w:p>
-            <w:pPr/>
-            <w:r>
-              <w:t xml:space="preserve">25 USD, paiement unique</w:t>
             </w:r>
           </w:p>
         </w:tc>

</xml_diff>